<commit_message>
Kullanılmayan public/hero.png kaldırıldı + Türkçe konu dosyası güncellendi
Co-Authored-By: Claude Opus 4.8 <noreply@anthropic.com>
</commit_message>
<xml_diff>
--- a/sinavlar/TÜRKÇE DİL BİLGİSİ KONULARI.docx
+++ b/sinavlar/TÜRKÇE DİL BİLGİSİ KONULARI.docx
@@ -1604,180 +1604,8 @@
           <w:lang w:eastAsia="tr-TR"/>
           <w14:ligatures w14:val="none"/>
         </w:rPr>
-        <w:t>Sözcükte Anlam</w:t>
-      </w:r>
-    </w:p>
-    <w:p>
-      <w:pPr>
-        <w:pBdr>
-          <w:top w:val="single" w:sz="2" w:space="0" w:color="F1F4F5"/>
-          <w:left w:val="single" w:sz="2" w:space="0" w:color="F1F4F5"/>
-          <w:bottom w:val="single" w:sz="2" w:space="0" w:color="F1F4F5"/>
-          <w:right w:val="single" w:sz="2" w:space="0" w:color="F1F4F5"/>
-        </w:pBdr>
-        <w:shd w:val="clear" w:color="auto" w:fill="FFFFFF"/>
-        <w:spacing w:after="0" w:line="240" w:lineRule="auto"/>
-        <w:rPr>
-          <w:rFonts w:ascii="Nunito" w:eastAsia="Times New Roman" w:hAnsi="Nunito" w:cs="Times New Roman"/>
-          <w:color w:val="000000"/>
-          <w:kern w:val="0"/>
-          <w:lang w:eastAsia="tr-TR"/>
-          <w14:ligatures w14:val="none"/>
-        </w:rPr>
-      </w:pPr>
-      <w:r>
-        <w:rPr>
-          <w:rFonts w:ascii="Lucida Sans Unicode" w:eastAsia="Times New Roman" w:hAnsi="Lucida Sans Unicode" w:cs="Lucida Sans Unicode"/>
-          <w:color w:val="000000"/>
-          <w:kern w:val="0"/>
-          <w:bdr w:val="single" w:sz="2" w:space="0" w:color="F1F4F5" w:frame="1"/>
-          <w:lang w:eastAsia="tr-TR"/>
-          <w14:ligatures w14:val="none"/>
-        </w:rPr>
-        <w:t>-Gerçek, Mecaz ve Terim Anlam</w:t>
-      </w:r>
-    </w:p>
-    <w:p>
-      <w:pPr>
-        <w:pBdr>
-          <w:top w:val="single" w:sz="2" w:space="0" w:color="F1F4F5"/>
-          <w:left w:val="single" w:sz="2" w:space="0" w:color="F1F4F5"/>
-          <w:bottom w:val="single" w:sz="2" w:space="0" w:color="F1F4F5"/>
-          <w:right w:val="single" w:sz="2" w:space="0" w:color="F1F4F5"/>
-        </w:pBdr>
-        <w:shd w:val="clear" w:color="auto" w:fill="FFFFFF"/>
-        <w:spacing w:after="0" w:line="240" w:lineRule="auto"/>
-        <w:rPr>
-          <w:rFonts w:ascii="Nunito" w:eastAsia="Times New Roman" w:hAnsi="Nunito" w:cs="Times New Roman"/>
-          <w:color w:val="000000"/>
-          <w:kern w:val="0"/>
-          <w:lang w:eastAsia="tr-TR"/>
-          <w14:ligatures w14:val="none"/>
-        </w:rPr>
-      </w:pPr>
-      <w:r>
-        <w:rPr>
-          <w:rFonts w:ascii="Lucida Sans Unicode" w:eastAsia="Times New Roman" w:hAnsi="Lucida Sans Unicode" w:cs="Lucida Sans Unicode"/>
-          <w:color w:val="000000"/>
-          <w:kern w:val="0"/>
-          <w:bdr w:val="single" w:sz="2" w:space="0" w:color="F1F4F5" w:frame="1"/>
-          <w:lang w:eastAsia="tr-TR"/>
-          <w14:ligatures w14:val="none"/>
-        </w:rPr>
-        <w:t>-Sözcükler Arası Anlam İlişkileri</w:t>
-      </w:r>
-    </w:p>
-    <w:p>
-      <w:pPr>
-        <w:pBdr>
-          <w:top w:val="single" w:sz="2" w:space="0" w:color="F1F4F5"/>
-          <w:left w:val="single" w:sz="2" w:space="0" w:color="F1F4F5"/>
-          <w:bottom w:val="single" w:sz="2" w:space="0" w:color="F1F4F5"/>
-          <w:right w:val="single" w:sz="2" w:space="0" w:color="F1F4F5"/>
-        </w:pBdr>
-        <w:shd w:val="clear" w:color="auto" w:fill="FFFFFF"/>
-        <w:spacing w:after="0" w:line="240" w:lineRule="auto"/>
-        <w:rPr>
-          <w:rFonts w:ascii="Nunito" w:eastAsia="Times New Roman" w:hAnsi="Nunito" w:cs="Times New Roman"/>
-          <w:color w:val="000000"/>
-          <w:kern w:val="0"/>
-          <w:lang w:eastAsia="tr-TR"/>
-          <w14:ligatures w14:val="none"/>
-        </w:rPr>
-      </w:pPr>
-      <w:r>
-        <w:rPr>
-          <w:rFonts w:ascii="Lucida Sans Unicode" w:eastAsia="Times New Roman" w:hAnsi="Lucida Sans Unicode" w:cs="Lucida Sans Unicode"/>
-          <w:color w:val="000000"/>
-          <w:kern w:val="0"/>
-          <w:bdr w:val="single" w:sz="2" w:space="0" w:color="F1F4F5" w:frame="1"/>
-          <w:lang w:eastAsia="tr-TR"/>
-          <w14:ligatures w14:val="none"/>
-        </w:rPr>
-        <w:t>-Kelime ve Kelime Gruplarının Anlamı</w:t>
-      </w:r>
-    </w:p>
-    <w:p>
-      <w:pPr>
-        <w:pBdr>
-          <w:top w:val="single" w:sz="2" w:space="0" w:color="F1F4F5"/>
-          <w:left w:val="single" w:sz="2" w:space="0" w:color="F1F4F5"/>
-          <w:bottom w:val="single" w:sz="2" w:space="0" w:color="F1F4F5"/>
-          <w:right w:val="single" w:sz="2" w:space="0" w:color="F1F4F5"/>
-        </w:pBdr>
-        <w:shd w:val="clear" w:color="auto" w:fill="FFFFFF"/>
-        <w:spacing w:after="0" w:line="240" w:lineRule="auto"/>
-        <w:rPr>
-          <w:rFonts w:ascii="Nunito" w:eastAsia="Times New Roman" w:hAnsi="Nunito" w:cs="Times New Roman"/>
-          <w:color w:val="000000"/>
-          <w:kern w:val="0"/>
-          <w:lang w:eastAsia="tr-TR"/>
-          <w14:ligatures w14:val="none"/>
-        </w:rPr>
-      </w:pPr>
-      <w:r>
-        <w:rPr>
-          <w:rFonts w:ascii="Lucida Sans Unicode" w:eastAsia="Times New Roman" w:hAnsi="Lucida Sans Unicode" w:cs="Lucida Sans Unicode"/>
-          <w:color w:val="000000"/>
-          <w:kern w:val="0"/>
-          <w:bdr w:val="single" w:sz="2" w:space="0" w:color="F1F4F5" w:frame="1"/>
-          <w:lang w:eastAsia="tr-TR"/>
-          <w14:ligatures w14:val="none"/>
-        </w:rPr>
-        <w:t>-Aynı Kavram Alanına Giren Sözcükler</w:t>
-      </w:r>
-    </w:p>
-    <w:p>
-      <w:pPr>
-        <w:pBdr>
-          <w:top w:val="single" w:sz="2" w:space="0" w:color="F1F4F5"/>
-          <w:left w:val="single" w:sz="2" w:space="0" w:color="F1F4F5"/>
-          <w:bottom w:val="single" w:sz="2" w:space="0" w:color="F1F4F5"/>
-          <w:right w:val="single" w:sz="2" w:space="0" w:color="F1F4F5"/>
-        </w:pBdr>
-        <w:shd w:val="clear" w:color="auto" w:fill="FFFFFF"/>
-        <w:spacing w:after="0" w:line="240" w:lineRule="auto"/>
-        <w:rPr>
-          <w:rFonts w:ascii="Nunito" w:eastAsia="Times New Roman" w:hAnsi="Nunito" w:cs="Times New Roman"/>
-          <w:color w:val="000000"/>
-          <w:kern w:val="0"/>
-          <w:lang w:eastAsia="tr-TR"/>
-          <w14:ligatures w14:val="none"/>
-        </w:rPr>
-      </w:pPr>
-      <w:r>
-        <w:rPr>
-          <w:rFonts w:ascii="Lucida Sans Unicode" w:eastAsia="Times New Roman" w:hAnsi="Lucida Sans Unicode" w:cs="Lucida Sans Unicode"/>
-          <w:color w:val="000000"/>
-          <w:kern w:val="0"/>
-          <w:bdr w:val="single" w:sz="2" w:space="0" w:color="F1F4F5" w:frame="1"/>
-          <w:lang w:eastAsia="tr-TR"/>
-          <w14:ligatures w14:val="none"/>
-        </w:rPr>
-        <w:t>-Dilimize Yerleşmemiş Yabancı Kelimeler</w:t>
-      </w:r>
-    </w:p>
-    <w:p>
-      <w:pPr>
-        <w:pBdr>
-          <w:top w:val="single" w:sz="2" w:space="0" w:color="F1F4F5"/>
-          <w:left w:val="single" w:sz="2" w:space="0" w:color="F1F4F5"/>
-          <w:bottom w:val="single" w:sz="2" w:space="0" w:color="F1F4F5"/>
-          <w:right w:val="single" w:sz="2" w:space="0" w:color="F1F4F5"/>
-        </w:pBdr>
-        <w:shd w:val="clear" w:color="auto" w:fill="FFFFFF"/>
-        <w:spacing w:after="0" w:line="240" w:lineRule="auto"/>
-        <w:outlineLvl w:val="2"/>
-        <w:rPr>
-          <w:rFonts w:ascii="Nunito" w:eastAsia="Times New Roman" w:hAnsi="Nunito" w:cs="Times New Roman"/>
-          <w:b/>
-          <w:bCs/>
-          <w:color w:val="000000"/>
-          <w:kern w:val="0"/>
-          <w:lang w:eastAsia="tr-TR"/>
-          <w14:ligatures w14:val="none"/>
-        </w:rPr>
-      </w:pPr>
+        <w:t>1</w:t>
+      </w:r>
       <w:r>
         <w:rPr>
           <w:rFonts w:ascii="inherit" w:eastAsia="Times New Roman" w:hAnsi="inherit" w:cs="Lucida Sans Unicode"/>
@@ -1791,157 +1619,157 @@
           <w:lang w:eastAsia="tr-TR"/>
           <w14:ligatures w14:val="none"/>
         </w:rPr>
-        <w:t>Cümlede Anlam</w:t>
-      </w:r>
-    </w:p>
-    <w:p>
-      <w:pPr>
-        <w:pBdr>
-          <w:top w:val="single" w:sz="2" w:space="0" w:color="F1F4F5"/>
-          <w:left w:val="single" w:sz="2" w:space="0" w:color="F1F4F5"/>
-          <w:bottom w:val="single" w:sz="2" w:space="0" w:color="F1F4F5"/>
-          <w:right w:val="single" w:sz="2" w:space="0" w:color="F1F4F5"/>
-        </w:pBdr>
-        <w:shd w:val="clear" w:color="auto" w:fill="FFFFFF"/>
-        <w:spacing w:after="0" w:line="240" w:lineRule="auto"/>
-        <w:rPr>
-          <w:rFonts w:ascii="Nunito" w:eastAsia="Times New Roman" w:hAnsi="Nunito" w:cs="Times New Roman"/>
-          <w:color w:val="000000"/>
-          <w:kern w:val="0"/>
-          <w:lang w:eastAsia="tr-TR"/>
-          <w14:ligatures w14:val="none"/>
-        </w:rPr>
-      </w:pPr>
-      <w:r>
-        <w:rPr>
-          <w:rFonts w:ascii="Lucida Sans Unicode" w:eastAsia="Times New Roman" w:hAnsi="Lucida Sans Unicode" w:cs="Lucida Sans Unicode"/>
-          <w:color w:val="000000"/>
-          <w:kern w:val="0"/>
-          <w:bdr w:val="single" w:sz="2" w:space="0" w:color="F1F4F5" w:frame="1"/>
-          <w:lang w:eastAsia="tr-TR"/>
-          <w14:ligatures w14:val="none"/>
-        </w:rPr>
-        <w:t>-Öznel ve Nesnel Cümleler</w:t>
-      </w:r>
-    </w:p>
-    <w:p>
-      <w:pPr>
-        <w:pBdr>
-          <w:top w:val="single" w:sz="2" w:space="0" w:color="F1F4F5"/>
-          <w:left w:val="single" w:sz="2" w:space="0" w:color="F1F4F5"/>
-          <w:bottom w:val="single" w:sz="2" w:space="0" w:color="F1F4F5"/>
-          <w:right w:val="single" w:sz="2" w:space="0" w:color="F1F4F5"/>
-        </w:pBdr>
-        <w:shd w:val="clear" w:color="auto" w:fill="FFFFFF"/>
-        <w:spacing w:after="0" w:line="240" w:lineRule="auto"/>
-        <w:rPr>
-          <w:rFonts w:ascii="Nunito" w:eastAsia="Times New Roman" w:hAnsi="Nunito" w:cs="Times New Roman"/>
-          <w:color w:val="000000"/>
-          <w:kern w:val="0"/>
-          <w:lang w:eastAsia="tr-TR"/>
-          <w14:ligatures w14:val="none"/>
-        </w:rPr>
-      </w:pPr>
-      <w:r>
-        <w:rPr>
-          <w:rFonts w:ascii="Lucida Sans Unicode" w:eastAsia="Times New Roman" w:hAnsi="Lucida Sans Unicode" w:cs="Lucida Sans Unicode"/>
-          <w:color w:val="000000"/>
-          <w:kern w:val="0"/>
-          <w:bdr w:val="single" w:sz="2" w:space="0" w:color="F1F4F5" w:frame="1"/>
-          <w:lang w:eastAsia="tr-TR"/>
-          <w14:ligatures w14:val="none"/>
-        </w:rPr>
-        <w:t>-Neden, Amaç ve Koşul Cümleleri</w:t>
-      </w:r>
-    </w:p>
-    <w:p>
-      <w:pPr>
-        <w:pBdr>
-          <w:top w:val="single" w:sz="2" w:space="0" w:color="F1F4F5"/>
-          <w:left w:val="single" w:sz="2" w:space="0" w:color="F1F4F5"/>
-          <w:bottom w:val="single" w:sz="2" w:space="0" w:color="F1F4F5"/>
-          <w:right w:val="single" w:sz="2" w:space="0" w:color="F1F4F5"/>
-        </w:pBdr>
-        <w:shd w:val="clear" w:color="auto" w:fill="FFFFFF"/>
-        <w:spacing w:after="0" w:line="240" w:lineRule="auto"/>
-        <w:rPr>
-          <w:rFonts w:ascii="Nunito" w:eastAsia="Times New Roman" w:hAnsi="Nunito" w:cs="Times New Roman"/>
-          <w:color w:val="000000"/>
-          <w:kern w:val="0"/>
-          <w:lang w:eastAsia="tr-TR"/>
-          <w14:ligatures w14:val="none"/>
-        </w:rPr>
-      </w:pPr>
-      <w:r>
-        <w:rPr>
-          <w:rFonts w:ascii="Lucida Sans Unicode" w:eastAsia="Times New Roman" w:hAnsi="Lucida Sans Unicode" w:cs="Lucida Sans Unicode"/>
-          <w:color w:val="000000"/>
-          <w:kern w:val="0"/>
-          <w:bdr w:val="single" w:sz="2" w:space="0" w:color="F1F4F5" w:frame="1"/>
-          <w:lang w:eastAsia="tr-TR"/>
-          <w14:ligatures w14:val="none"/>
-        </w:rPr>
-        <w:t>-Cümlede Kavram ve Duygular</w:t>
-      </w:r>
-    </w:p>
-    <w:p>
-      <w:pPr>
-        <w:pBdr>
-          <w:top w:val="single" w:sz="2" w:space="0" w:color="F1F4F5"/>
-          <w:left w:val="single" w:sz="2" w:space="0" w:color="F1F4F5"/>
-          <w:bottom w:val="single" w:sz="2" w:space="0" w:color="F1F4F5"/>
-          <w:right w:val="single" w:sz="2" w:space="0" w:color="F1F4F5"/>
-        </w:pBdr>
-        <w:shd w:val="clear" w:color="auto" w:fill="FFFFFF"/>
-        <w:spacing w:after="0" w:line="240" w:lineRule="auto"/>
-        <w:rPr>
-          <w:rFonts w:ascii="Nunito" w:eastAsia="Times New Roman" w:hAnsi="Nunito" w:cs="Times New Roman"/>
-          <w:color w:val="000000"/>
-          <w:kern w:val="0"/>
-          <w:lang w:eastAsia="tr-TR"/>
-          <w14:ligatures w14:val="none"/>
-        </w:rPr>
-      </w:pPr>
-      <w:r>
-        <w:rPr>
-          <w:rFonts w:ascii="Lucida Sans Unicode" w:eastAsia="Times New Roman" w:hAnsi="Lucida Sans Unicode" w:cs="Lucida Sans Unicode"/>
-          <w:color w:val="000000"/>
-          <w:kern w:val="0"/>
-          <w:bdr w:val="single" w:sz="2" w:space="0" w:color="F1F4F5" w:frame="1"/>
-          <w:lang w:eastAsia="tr-TR"/>
-          <w14:ligatures w14:val="none"/>
-        </w:rPr>
-        <w:t>-Cümlede Anlam</w:t>
-      </w:r>
-    </w:p>
-    <w:p>
-      <w:pPr>
-        <w:pBdr>
-          <w:top w:val="single" w:sz="2" w:space="0" w:color="F1F4F5"/>
-          <w:left w:val="single" w:sz="2" w:space="0" w:color="F1F4F5"/>
-          <w:bottom w:val="single" w:sz="2" w:space="0" w:color="F1F4F5"/>
-          <w:right w:val="single" w:sz="2" w:space="0" w:color="F1F4F5"/>
-        </w:pBdr>
-        <w:shd w:val="clear" w:color="auto" w:fill="FFFFFF"/>
-        <w:spacing w:after="0" w:line="240" w:lineRule="auto"/>
-        <w:rPr>
-          <w:rFonts w:ascii="Nunito" w:eastAsia="Times New Roman" w:hAnsi="Nunito" w:cs="Times New Roman"/>
-          <w:color w:val="000000"/>
-          <w:kern w:val="0"/>
-          <w:lang w:eastAsia="tr-TR"/>
-          <w14:ligatures w14:val="none"/>
-        </w:rPr>
-      </w:pPr>
-      <w:r>
-        <w:rPr>
-          <w:rFonts w:ascii="Lucida Sans Unicode" w:eastAsia="Times New Roman" w:hAnsi="Lucida Sans Unicode" w:cs="Lucida Sans Unicode"/>
-          <w:color w:val="000000"/>
-          <w:kern w:val="0"/>
-          <w:bdr w:val="single" w:sz="2" w:space="0" w:color="F1F4F5" w:frame="1"/>
-          <w:lang w:eastAsia="tr-TR"/>
-          <w14:ligatures w14:val="none"/>
-        </w:rPr>
-        <w:t>-Örtülü Anlam</w:t>
+        <w:t>Sözcükte Anlam</w:t>
+      </w:r>
+    </w:p>
+    <w:p>
+      <w:pPr>
+        <w:pBdr>
+          <w:top w:val="single" w:sz="2" w:space="0" w:color="F1F4F5"/>
+          <w:left w:val="single" w:sz="2" w:space="0" w:color="F1F4F5"/>
+          <w:bottom w:val="single" w:sz="2" w:space="0" w:color="F1F4F5"/>
+          <w:right w:val="single" w:sz="2" w:space="0" w:color="F1F4F5"/>
+        </w:pBdr>
+        <w:shd w:val="clear" w:color="auto" w:fill="FFFFFF"/>
+        <w:spacing w:after="0" w:line="240" w:lineRule="auto"/>
+        <w:rPr>
+          <w:rFonts w:ascii="Nunito" w:eastAsia="Times New Roman" w:hAnsi="Nunito" w:cs="Times New Roman"/>
+          <w:color w:val="000000"/>
+          <w:kern w:val="0"/>
+          <w:lang w:eastAsia="tr-TR"/>
+          <w14:ligatures w14:val="none"/>
+        </w:rPr>
+      </w:pPr>
+      <w:r>
+        <w:rPr>
+          <w:rFonts w:ascii="Lucida Sans Unicode" w:eastAsia="Times New Roman" w:hAnsi="Lucida Sans Unicode" w:cs="Lucida Sans Unicode"/>
+          <w:color w:val="000000"/>
+          <w:kern w:val="0"/>
+          <w:bdr w:val="single" w:sz="2" w:space="0" w:color="F1F4F5" w:frame="1"/>
+          <w:lang w:eastAsia="tr-TR"/>
+          <w14:ligatures w14:val="none"/>
+        </w:rPr>
+        <w:t>-Gerçek, Mecaz ve Terim Anlam</w:t>
+      </w:r>
+    </w:p>
+    <w:p>
+      <w:pPr>
+        <w:pBdr>
+          <w:top w:val="single" w:sz="2" w:space="0" w:color="F1F4F5"/>
+          <w:left w:val="single" w:sz="2" w:space="0" w:color="F1F4F5"/>
+          <w:bottom w:val="single" w:sz="2" w:space="0" w:color="F1F4F5"/>
+          <w:right w:val="single" w:sz="2" w:space="0" w:color="F1F4F5"/>
+        </w:pBdr>
+        <w:shd w:val="clear" w:color="auto" w:fill="FFFFFF"/>
+        <w:spacing w:after="0" w:line="240" w:lineRule="auto"/>
+        <w:rPr>
+          <w:rFonts w:ascii="Nunito" w:eastAsia="Times New Roman" w:hAnsi="Nunito" w:cs="Times New Roman"/>
+          <w:color w:val="000000"/>
+          <w:kern w:val="0"/>
+          <w:lang w:eastAsia="tr-TR"/>
+          <w14:ligatures w14:val="none"/>
+        </w:rPr>
+      </w:pPr>
+      <w:r>
+        <w:rPr>
+          <w:rFonts w:ascii="Lucida Sans Unicode" w:eastAsia="Times New Roman" w:hAnsi="Lucida Sans Unicode" w:cs="Lucida Sans Unicode"/>
+          <w:color w:val="000000"/>
+          <w:kern w:val="0"/>
+          <w:bdr w:val="single" w:sz="2" w:space="0" w:color="F1F4F5" w:frame="1"/>
+          <w:lang w:eastAsia="tr-TR"/>
+          <w14:ligatures w14:val="none"/>
+        </w:rPr>
+        <w:t>-Sözcükler Arası Anlam İlişkileri</w:t>
+      </w:r>
+    </w:p>
+    <w:p>
+      <w:pPr>
+        <w:pBdr>
+          <w:top w:val="single" w:sz="2" w:space="0" w:color="F1F4F5"/>
+          <w:left w:val="single" w:sz="2" w:space="0" w:color="F1F4F5"/>
+          <w:bottom w:val="single" w:sz="2" w:space="0" w:color="F1F4F5"/>
+          <w:right w:val="single" w:sz="2" w:space="0" w:color="F1F4F5"/>
+        </w:pBdr>
+        <w:shd w:val="clear" w:color="auto" w:fill="FFFFFF"/>
+        <w:spacing w:after="0" w:line="240" w:lineRule="auto"/>
+        <w:rPr>
+          <w:rFonts w:ascii="Nunito" w:eastAsia="Times New Roman" w:hAnsi="Nunito" w:cs="Times New Roman"/>
+          <w:color w:val="000000"/>
+          <w:kern w:val="0"/>
+          <w:lang w:eastAsia="tr-TR"/>
+          <w14:ligatures w14:val="none"/>
+        </w:rPr>
+      </w:pPr>
+      <w:r>
+        <w:rPr>
+          <w:rFonts w:ascii="Lucida Sans Unicode" w:eastAsia="Times New Roman" w:hAnsi="Lucida Sans Unicode" w:cs="Lucida Sans Unicode"/>
+          <w:color w:val="000000"/>
+          <w:kern w:val="0"/>
+          <w:bdr w:val="single" w:sz="2" w:space="0" w:color="F1F4F5" w:frame="1"/>
+          <w:lang w:eastAsia="tr-TR"/>
+          <w14:ligatures w14:val="none"/>
+        </w:rPr>
+        <w:t>-Kelime ve Kelime Gruplarının Anlamı</w:t>
+      </w:r>
+    </w:p>
+    <w:p>
+      <w:pPr>
+        <w:pBdr>
+          <w:top w:val="single" w:sz="2" w:space="0" w:color="F1F4F5"/>
+          <w:left w:val="single" w:sz="2" w:space="0" w:color="F1F4F5"/>
+          <w:bottom w:val="single" w:sz="2" w:space="0" w:color="F1F4F5"/>
+          <w:right w:val="single" w:sz="2" w:space="0" w:color="F1F4F5"/>
+        </w:pBdr>
+        <w:shd w:val="clear" w:color="auto" w:fill="FFFFFF"/>
+        <w:spacing w:after="0" w:line="240" w:lineRule="auto"/>
+        <w:rPr>
+          <w:rFonts w:ascii="Nunito" w:eastAsia="Times New Roman" w:hAnsi="Nunito" w:cs="Times New Roman"/>
+          <w:color w:val="000000"/>
+          <w:kern w:val="0"/>
+          <w:lang w:eastAsia="tr-TR"/>
+          <w14:ligatures w14:val="none"/>
+        </w:rPr>
+      </w:pPr>
+      <w:r>
+        <w:rPr>
+          <w:rFonts w:ascii="Lucida Sans Unicode" w:eastAsia="Times New Roman" w:hAnsi="Lucida Sans Unicode" w:cs="Lucida Sans Unicode"/>
+          <w:color w:val="000000"/>
+          <w:kern w:val="0"/>
+          <w:bdr w:val="single" w:sz="2" w:space="0" w:color="F1F4F5" w:frame="1"/>
+          <w:lang w:eastAsia="tr-TR"/>
+          <w14:ligatures w14:val="none"/>
+        </w:rPr>
+        <w:t>-Aynı Kavram Alanına Giren Sözcükler</w:t>
+      </w:r>
+    </w:p>
+    <w:p>
+      <w:pPr>
+        <w:pBdr>
+          <w:top w:val="single" w:sz="2" w:space="0" w:color="F1F4F5"/>
+          <w:left w:val="single" w:sz="2" w:space="0" w:color="F1F4F5"/>
+          <w:bottom w:val="single" w:sz="2" w:space="0" w:color="F1F4F5"/>
+          <w:right w:val="single" w:sz="2" w:space="0" w:color="F1F4F5"/>
+        </w:pBdr>
+        <w:shd w:val="clear" w:color="auto" w:fill="FFFFFF"/>
+        <w:spacing w:after="0" w:line="240" w:lineRule="auto"/>
+        <w:rPr>
+          <w:rFonts w:ascii="Nunito" w:eastAsia="Times New Roman" w:hAnsi="Nunito" w:cs="Times New Roman"/>
+          <w:color w:val="000000"/>
+          <w:kern w:val="0"/>
+          <w:lang w:eastAsia="tr-TR"/>
+          <w14:ligatures w14:val="none"/>
+        </w:rPr>
+      </w:pPr>
+      <w:r>
+        <w:rPr>
+          <w:rFonts w:ascii="Lucida Sans Unicode" w:eastAsia="Times New Roman" w:hAnsi="Lucida Sans Unicode" w:cs="Lucida Sans Unicode"/>
+          <w:color w:val="000000"/>
+          <w:kern w:val="0"/>
+          <w:bdr w:val="single" w:sz="2" w:space="0" w:color="F1F4F5" w:frame="1"/>
+          <w:lang w:eastAsia="tr-TR"/>
+          <w14:ligatures w14:val="none"/>
+        </w:rPr>
+        <w:t>-Dilimize Yerleşmemiş Yabancı Kelimeler</w:t>
       </w:r>
     </w:p>
     <w:p>
@@ -1978,90 +1806,8 @@
           <w:lang w:eastAsia="tr-TR"/>
           <w14:ligatures w14:val="none"/>
         </w:rPr>
-        <w:t>Deyimler ve Atasözleri</w:t>
-      </w:r>
-    </w:p>
-    <w:p>
-      <w:pPr>
-        <w:pBdr>
-          <w:top w:val="single" w:sz="2" w:space="0" w:color="F1F4F5"/>
-          <w:left w:val="single" w:sz="2" w:space="0" w:color="F1F4F5"/>
-          <w:bottom w:val="single" w:sz="2" w:space="0" w:color="F1F4F5"/>
-          <w:right w:val="single" w:sz="2" w:space="0" w:color="F1F4F5"/>
-        </w:pBdr>
-        <w:shd w:val="clear" w:color="auto" w:fill="FFFFFF"/>
-        <w:spacing w:after="0" w:line="240" w:lineRule="auto"/>
-        <w:rPr>
-          <w:rFonts w:ascii="Nunito" w:eastAsia="Times New Roman" w:hAnsi="Nunito" w:cs="Times New Roman"/>
-          <w:color w:val="000000"/>
-          <w:kern w:val="0"/>
-          <w:lang w:eastAsia="tr-TR"/>
-          <w14:ligatures w14:val="none"/>
-        </w:rPr>
-      </w:pPr>
-      <w:r>
-        <w:rPr>
-          <w:rFonts w:ascii="inherit" w:eastAsia="Times New Roman" w:hAnsi="inherit" w:cs="Lucida Sans Unicode"/>
-          <w:color w:val="000000"/>
-          <w:kern w:val="0"/>
-          <w:bdr w:val="single" w:sz="2" w:space="0" w:color="F1F4F5" w:frame="1"/>
-          <w:lang w:eastAsia="tr-TR"/>
-          <w14:ligatures w14:val="none"/>
-        </w:rPr>
-        <w:t>-Atasözleri ve Özdeyişler</w:t>
-      </w:r>
-    </w:p>
-    <w:p>
-      <w:pPr>
-        <w:pBdr>
-          <w:top w:val="single" w:sz="2" w:space="0" w:color="F1F4F5"/>
-          <w:left w:val="single" w:sz="2" w:space="0" w:color="F1F4F5"/>
-          <w:bottom w:val="single" w:sz="2" w:space="0" w:color="F1F4F5"/>
-          <w:right w:val="single" w:sz="2" w:space="0" w:color="F1F4F5"/>
-        </w:pBdr>
-        <w:shd w:val="clear" w:color="auto" w:fill="FFFFFF"/>
-        <w:spacing w:after="0" w:line="240" w:lineRule="auto"/>
-        <w:rPr>
-          <w:rFonts w:ascii="Nunito" w:eastAsia="Times New Roman" w:hAnsi="Nunito" w:cs="Times New Roman"/>
-          <w:color w:val="000000"/>
-          <w:kern w:val="0"/>
-          <w:lang w:eastAsia="tr-TR"/>
-          <w14:ligatures w14:val="none"/>
-        </w:rPr>
-      </w:pPr>
-      <w:r>
-        <w:rPr>
-          <w:rFonts w:ascii="inherit" w:eastAsia="Times New Roman" w:hAnsi="inherit" w:cs="Lucida Sans Unicode"/>
-          <w:color w:val="000000"/>
-          <w:kern w:val="0"/>
-          <w:bdr w:val="single" w:sz="2" w:space="0" w:color="F1F4F5" w:frame="1"/>
-          <w:lang w:eastAsia="tr-TR"/>
-          <w14:ligatures w14:val="none"/>
-        </w:rPr>
-        <w:t>-Deyimler</w:t>
-      </w:r>
-    </w:p>
-    <w:p>
-      <w:pPr>
-        <w:pBdr>
-          <w:top w:val="single" w:sz="2" w:space="0" w:color="F1F4F5"/>
-          <w:left w:val="single" w:sz="2" w:space="0" w:color="F1F4F5"/>
-          <w:bottom w:val="single" w:sz="2" w:space="0" w:color="F1F4F5"/>
-          <w:right w:val="single" w:sz="2" w:space="0" w:color="F1F4F5"/>
-        </w:pBdr>
-        <w:shd w:val="clear" w:color="auto" w:fill="FFFFFF"/>
-        <w:spacing w:after="0" w:line="240" w:lineRule="auto"/>
-        <w:outlineLvl w:val="2"/>
-        <w:rPr>
-          <w:rFonts w:ascii="Nunito" w:eastAsia="Times New Roman" w:hAnsi="Nunito" w:cs="Times New Roman"/>
-          <w:b/>
-          <w:bCs/>
-          <w:color w:val="000000"/>
-          <w:kern w:val="0"/>
-          <w:lang w:eastAsia="tr-TR"/>
-          <w14:ligatures w14:val="none"/>
-        </w:rPr>
-      </w:pPr>
+        <w:t>2</w:t>
+      </w:r>
       <w:r>
         <w:rPr>
           <w:rFonts w:ascii="inherit" w:eastAsia="Times New Roman" w:hAnsi="inherit" w:cs="Lucida Sans Unicode"/>
@@ -2075,67 +1821,157 @@
           <w:lang w:eastAsia="tr-TR"/>
           <w14:ligatures w14:val="none"/>
         </w:rPr>
-        <w:t>Söz Sanatları</w:t>
-      </w:r>
-    </w:p>
-    <w:p>
-      <w:pPr>
-        <w:pBdr>
-          <w:top w:val="single" w:sz="2" w:space="0" w:color="F1F4F5"/>
-          <w:left w:val="single" w:sz="2" w:space="0" w:color="F1F4F5"/>
-          <w:bottom w:val="single" w:sz="2" w:space="0" w:color="F1F4F5"/>
-          <w:right w:val="single" w:sz="2" w:space="0" w:color="F1F4F5"/>
-        </w:pBdr>
-        <w:shd w:val="clear" w:color="auto" w:fill="FFFFFF"/>
-        <w:spacing w:after="0" w:line="240" w:lineRule="auto"/>
-        <w:rPr>
-          <w:rFonts w:ascii="Nunito" w:eastAsia="Times New Roman" w:hAnsi="Nunito" w:cs="Times New Roman"/>
-          <w:color w:val="000000"/>
-          <w:kern w:val="0"/>
-          <w:lang w:eastAsia="tr-TR"/>
-          <w14:ligatures w14:val="none"/>
-        </w:rPr>
-      </w:pPr>
-      <w:r>
-        <w:rPr>
-          <w:rFonts w:ascii="Lucida Sans Unicode" w:eastAsia="Times New Roman" w:hAnsi="Lucida Sans Unicode" w:cs="Lucida Sans Unicode"/>
-          <w:color w:val="000000"/>
-          <w:kern w:val="0"/>
-          <w:bdr w:val="single" w:sz="2" w:space="0" w:color="F1F4F5" w:frame="1"/>
-          <w:lang w:eastAsia="tr-TR"/>
-          <w14:ligatures w14:val="none"/>
-        </w:rPr>
-        <w:t>-Karşıtlık, Abartma, Konuşturma ve Kişileştirme</w:t>
-      </w:r>
-    </w:p>
-    <w:p>
-      <w:pPr>
-        <w:pBdr>
-          <w:top w:val="single" w:sz="2" w:space="0" w:color="F1F4F5"/>
-          <w:left w:val="single" w:sz="2" w:space="0" w:color="F1F4F5"/>
-          <w:bottom w:val="single" w:sz="2" w:space="0" w:color="F1F4F5"/>
-          <w:right w:val="single" w:sz="2" w:space="0" w:color="F1F4F5"/>
-        </w:pBdr>
-        <w:shd w:val="clear" w:color="auto" w:fill="FFFFFF"/>
-        <w:spacing w:after="0" w:line="240" w:lineRule="auto"/>
-        <w:rPr>
-          <w:rFonts w:ascii="Nunito" w:eastAsia="Times New Roman" w:hAnsi="Nunito" w:cs="Times New Roman"/>
-          <w:color w:val="000000"/>
-          <w:kern w:val="0"/>
-          <w:lang w:eastAsia="tr-TR"/>
-          <w14:ligatures w14:val="none"/>
-        </w:rPr>
-      </w:pPr>
-      <w:r>
-        <w:rPr>
-          <w:rFonts w:ascii="Lucida Sans Unicode" w:eastAsia="Times New Roman" w:hAnsi="Lucida Sans Unicode" w:cs="Lucida Sans Unicode"/>
-          <w:color w:val="000000"/>
-          <w:kern w:val="0"/>
-          <w:bdr w:val="single" w:sz="2" w:space="0" w:color="F1F4F5" w:frame="1"/>
-          <w:lang w:eastAsia="tr-TR"/>
-          <w14:ligatures w14:val="none"/>
-        </w:rPr>
-        <w:t>-Söyleşi, Günlük, Otobiyografi ve Biyografi</w:t>
+        <w:t>Cümlede Anlam</w:t>
+      </w:r>
+    </w:p>
+    <w:p>
+      <w:pPr>
+        <w:pBdr>
+          <w:top w:val="single" w:sz="2" w:space="0" w:color="F1F4F5"/>
+          <w:left w:val="single" w:sz="2" w:space="0" w:color="F1F4F5"/>
+          <w:bottom w:val="single" w:sz="2" w:space="0" w:color="F1F4F5"/>
+          <w:right w:val="single" w:sz="2" w:space="0" w:color="F1F4F5"/>
+        </w:pBdr>
+        <w:shd w:val="clear" w:color="auto" w:fill="FFFFFF"/>
+        <w:spacing w:after="0" w:line="240" w:lineRule="auto"/>
+        <w:rPr>
+          <w:rFonts w:ascii="Nunito" w:eastAsia="Times New Roman" w:hAnsi="Nunito" w:cs="Times New Roman"/>
+          <w:color w:val="000000"/>
+          <w:kern w:val="0"/>
+          <w:lang w:eastAsia="tr-TR"/>
+          <w14:ligatures w14:val="none"/>
+        </w:rPr>
+      </w:pPr>
+      <w:r>
+        <w:rPr>
+          <w:rFonts w:ascii="Lucida Sans Unicode" w:eastAsia="Times New Roman" w:hAnsi="Lucida Sans Unicode" w:cs="Lucida Sans Unicode"/>
+          <w:color w:val="000000"/>
+          <w:kern w:val="0"/>
+          <w:bdr w:val="single" w:sz="2" w:space="0" w:color="F1F4F5" w:frame="1"/>
+          <w:lang w:eastAsia="tr-TR"/>
+          <w14:ligatures w14:val="none"/>
+        </w:rPr>
+        <w:t>-Öznel ve Nesnel Cümleler</w:t>
+      </w:r>
+    </w:p>
+    <w:p>
+      <w:pPr>
+        <w:pBdr>
+          <w:top w:val="single" w:sz="2" w:space="0" w:color="F1F4F5"/>
+          <w:left w:val="single" w:sz="2" w:space="0" w:color="F1F4F5"/>
+          <w:bottom w:val="single" w:sz="2" w:space="0" w:color="F1F4F5"/>
+          <w:right w:val="single" w:sz="2" w:space="0" w:color="F1F4F5"/>
+        </w:pBdr>
+        <w:shd w:val="clear" w:color="auto" w:fill="FFFFFF"/>
+        <w:spacing w:after="0" w:line="240" w:lineRule="auto"/>
+        <w:rPr>
+          <w:rFonts w:ascii="Nunito" w:eastAsia="Times New Roman" w:hAnsi="Nunito" w:cs="Times New Roman"/>
+          <w:color w:val="000000"/>
+          <w:kern w:val="0"/>
+          <w:lang w:eastAsia="tr-TR"/>
+          <w14:ligatures w14:val="none"/>
+        </w:rPr>
+      </w:pPr>
+      <w:r>
+        <w:rPr>
+          <w:rFonts w:ascii="Lucida Sans Unicode" w:eastAsia="Times New Roman" w:hAnsi="Lucida Sans Unicode" w:cs="Lucida Sans Unicode"/>
+          <w:color w:val="000000"/>
+          <w:kern w:val="0"/>
+          <w:bdr w:val="single" w:sz="2" w:space="0" w:color="F1F4F5" w:frame="1"/>
+          <w:lang w:eastAsia="tr-TR"/>
+          <w14:ligatures w14:val="none"/>
+        </w:rPr>
+        <w:t>-Neden, Amaç ve Koşul Cümleleri</w:t>
+      </w:r>
+    </w:p>
+    <w:p>
+      <w:pPr>
+        <w:pBdr>
+          <w:top w:val="single" w:sz="2" w:space="0" w:color="F1F4F5"/>
+          <w:left w:val="single" w:sz="2" w:space="0" w:color="F1F4F5"/>
+          <w:bottom w:val="single" w:sz="2" w:space="0" w:color="F1F4F5"/>
+          <w:right w:val="single" w:sz="2" w:space="0" w:color="F1F4F5"/>
+        </w:pBdr>
+        <w:shd w:val="clear" w:color="auto" w:fill="FFFFFF"/>
+        <w:spacing w:after="0" w:line="240" w:lineRule="auto"/>
+        <w:rPr>
+          <w:rFonts w:ascii="Nunito" w:eastAsia="Times New Roman" w:hAnsi="Nunito" w:cs="Times New Roman"/>
+          <w:color w:val="000000"/>
+          <w:kern w:val="0"/>
+          <w:lang w:eastAsia="tr-TR"/>
+          <w14:ligatures w14:val="none"/>
+        </w:rPr>
+      </w:pPr>
+      <w:r>
+        <w:rPr>
+          <w:rFonts w:ascii="Lucida Sans Unicode" w:eastAsia="Times New Roman" w:hAnsi="Lucida Sans Unicode" w:cs="Lucida Sans Unicode"/>
+          <w:color w:val="000000"/>
+          <w:kern w:val="0"/>
+          <w:bdr w:val="single" w:sz="2" w:space="0" w:color="F1F4F5" w:frame="1"/>
+          <w:lang w:eastAsia="tr-TR"/>
+          <w14:ligatures w14:val="none"/>
+        </w:rPr>
+        <w:t>-Cümlede Kavram ve Duygular</w:t>
+      </w:r>
+    </w:p>
+    <w:p>
+      <w:pPr>
+        <w:pBdr>
+          <w:top w:val="single" w:sz="2" w:space="0" w:color="F1F4F5"/>
+          <w:left w:val="single" w:sz="2" w:space="0" w:color="F1F4F5"/>
+          <w:bottom w:val="single" w:sz="2" w:space="0" w:color="F1F4F5"/>
+          <w:right w:val="single" w:sz="2" w:space="0" w:color="F1F4F5"/>
+        </w:pBdr>
+        <w:shd w:val="clear" w:color="auto" w:fill="FFFFFF"/>
+        <w:spacing w:after="0" w:line="240" w:lineRule="auto"/>
+        <w:rPr>
+          <w:rFonts w:ascii="Nunito" w:eastAsia="Times New Roman" w:hAnsi="Nunito" w:cs="Times New Roman"/>
+          <w:color w:val="000000"/>
+          <w:kern w:val="0"/>
+          <w:lang w:eastAsia="tr-TR"/>
+          <w14:ligatures w14:val="none"/>
+        </w:rPr>
+      </w:pPr>
+      <w:r>
+        <w:rPr>
+          <w:rFonts w:ascii="Lucida Sans Unicode" w:eastAsia="Times New Roman" w:hAnsi="Lucida Sans Unicode" w:cs="Lucida Sans Unicode"/>
+          <w:color w:val="000000"/>
+          <w:kern w:val="0"/>
+          <w:bdr w:val="single" w:sz="2" w:space="0" w:color="F1F4F5" w:frame="1"/>
+          <w:lang w:eastAsia="tr-TR"/>
+          <w14:ligatures w14:val="none"/>
+        </w:rPr>
+        <w:t>-Cümlede Anlam</w:t>
+      </w:r>
+    </w:p>
+    <w:p>
+      <w:pPr>
+        <w:pBdr>
+          <w:top w:val="single" w:sz="2" w:space="0" w:color="F1F4F5"/>
+          <w:left w:val="single" w:sz="2" w:space="0" w:color="F1F4F5"/>
+          <w:bottom w:val="single" w:sz="2" w:space="0" w:color="F1F4F5"/>
+          <w:right w:val="single" w:sz="2" w:space="0" w:color="F1F4F5"/>
+        </w:pBdr>
+        <w:shd w:val="clear" w:color="auto" w:fill="FFFFFF"/>
+        <w:spacing w:after="0" w:line="240" w:lineRule="auto"/>
+        <w:rPr>
+          <w:rFonts w:ascii="Nunito" w:eastAsia="Times New Roman" w:hAnsi="Nunito" w:cs="Times New Roman"/>
+          <w:color w:val="000000"/>
+          <w:kern w:val="0"/>
+          <w:lang w:eastAsia="tr-TR"/>
+          <w14:ligatures w14:val="none"/>
+        </w:rPr>
+      </w:pPr>
+      <w:r>
+        <w:rPr>
+          <w:rFonts w:ascii="Lucida Sans Unicode" w:eastAsia="Times New Roman" w:hAnsi="Lucida Sans Unicode" w:cs="Lucida Sans Unicode"/>
+          <w:color w:val="000000"/>
+          <w:kern w:val="0"/>
+          <w:bdr w:val="single" w:sz="2" w:space="0" w:color="F1F4F5" w:frame="1"/>
+          <w:lang w:eastAsia="tr-TR"/>
+          <w14:ligatures w14:val="none"/>
+        </w:rPr>
+        <w:t>-Örtülü Anlam</w:t>
       </w:r>
     </w:p>
     <w:p>
@@ -2172,391 +2008,8 @@
           <w:lang w:eastAsia="tr-TR"/>
           <w14:ligatures w14:val="none"/>
         </w:rPr>
-        <w:t>Paragrafta Anlam</w:t>
-      </w:r>
-    </w:p>
-    <w:p>
-      <w:pPr>
-        <w:pBdr>
-          <w:top w:val="single" w:sz="2" w:space="0" w:color="F1F4F5"/>
-          <w:left w:val="single" w:sz="2" w:space="0" w:color="F1F4F5"/>
-          <w:bottom w:val="single" w:sz="2" w:space="0" w:color="F1F4F5"/>
-          <w:right w:val="single" w:sz="2" w:space="0" w:color="F1F4F5"/>
-        </w:pBdr>
-        <w:shd w:val="clear" w:color="auto" w:fill="FFFFFF"/>
-        <w:spacing w:after="0" w:line="240" w:lineRule="auto"/>
-        <w:rPr>
-          <w:rFonts w:ascii="Nunito" w:eastAsia="Times New Roman" w:hAnsi="Nunito" w:cs="Times New Roman"/>
-          <w:color w:val="000000"/>
-          <w:kern w:val="0"/>
-          <w:lang w:eastAsia="tr-TR"/>
-          <w14:ligatures w14:val="none"/>
-        </w:rPr>
-      </w:pPr>
-      <w:r>
-        <w:rPr>
-          <w:rFonts w:ascii="Lucida Sans Unicode" w:eastAsia="Times New Roman" w:hAnsi="Lucida Sans Unicode" w:cs="Lucida Sans Unicode"/>
-          <w:color w:val="000000"/>
-          <w:kern w:val="0"/>
-          <w:bdr w:val="single" w:sz="2" w:space="0" w:color="F1F4F5" w:frame="1"/>
-          <w:lang w:eastAsia="tr-TR"/>
-          <w14:ligatures w14:val="none"/>
-        </w:rPr>
-        <w:t>-Metnin Konusu ve Anahtar Kelimeler</w:t>
-      </w:r>
-    </w:p>
-    <w:p>
-      <w:pPr>
-        <w:pBdr>
-          <w:top w:val="single" w:sz="2" w:space="0" w:color="F1F4F5"/>
-          <w:left w:val="single" w:sz="2" w:space="0" w:color="F1F4F5"/>
-          <w:bottom w:val="single" w:sz="2" w:space="0" w:color="F1F4F5"/>
-          <w:right w:val="single" w:sz="2" w:space="0" w:color="F1F4F5"/>
-        </w:pBdr>
-        <w:shd w:val="clear" w:color="auto" w:fill="FFFFFF"/>
-        <w:spacing w:after="0" w:line="240" w:lineRule="auto"/>
-        <w:rPr>
-          <w:rFonts w:ascii="Nunito" w:eastAsia="Times New Roman" w:hAnsi="Nunito" w:cs="Times New Roman"/>
-          <w:color w:val="000000"/>
-          <w:kern w:val="0"/>
-          <w:lang w:eastAsia="tr-TR"/>
-          <w14:ligatures w14:val="none"/>
-        </w:rPr>
-      </w:pPr>
-      <w:r>
-        <w:rPr>
-          <w:rFonts w:ascii="Lucida Sans Unicode" w:eastAsia="Times New Roman" w:hAnsi="Lucida Sans Unicode" w:cs="Lucida Sans Unicode"/>
-          <w:color w:val="000000"/>
-          <w:kern w:val="0"/>
-          <w:bdr w:val="single" w:sz="2" w:space="0" w:color="F1F4F5" w:frame="1"/>
-          <w:lang w:eastAsia="tr-TR"/>
-          <w14:ligatures w14:val="none"/>
-        </w:rPr>
-        <w:t>-Metnin Başlığı</w:t>
-      </w:r>
-    </w:p>
-    <w:p>
-      <w:pPr>
-        <w:pBdr>
-          <w:top w:val="single" w:sz="2" w:space="0" w:color="F1F4F5"/>
-          <w:left w:val="single" w:sz="2" w:space="0" w:color="F1F4F5"/>
-          <w:bottom w:val="single" w:sz="2" w:space="0" w:color="F1F4F5"/>
-          <w:right w:val="single" w:sz="2" w:space="0" w:color="F1F4F5"/>
-        </w:pBdr>
-        <w:shd w:val="clear" w:color="auto" w:fill="FFFFFF"/>
-        <w:spacing w:after="0" w:line="240" w:lineRule="auto"/>
-        <w:rPr>
-          <w:rFonts w:ascii="Nunito" w:eastAsia="Times New Roman" w:hAnsi="Nunito" w:cs="Times New Roman"/>
-          <w:color w:val="000000"/>
-          <w:kern w:val="0"/>
-          <w:lang w:eastAsia="tr-TR"/>
-          <w14:ligatures w14:val="none"/>
-        </w:rPr>
-      </w:pPr>
-      <w:r>
-        <w:rPr>
-          <w:rFonts w:ascii="Lucida Sans Unicode" w:eastAsia="Times New Roman" w:hAnsi="Lucida Sans Unicode" w:cs="Lucida Sans Unicode"/>
-          <w:color w:val="000000"/>
-          <w:kern w:val="0"/>
-          <w:bdr w:val="single" w:sz="2" w:space="0" w:color="F1F4F5" w:frame="1"/>
-          <w:lang w:eastAsia="tr-TR"/>
-          <w14:ligatures w14:val="none"/>
-        </w:rPr>
-        <w:t>-Metnin Ana Düşüncesi</w:t>
-      </w:r>
-    </w:p>
-    <w:p>
-      <w:pPr>
-        <w:pBdr>
-          <w:top w:val="single" w:sz="2" w:space="0" w:color="F1F4F5"/>
-          <w:left w:val="single" w:sz="2" w:space="0" w:color="F1F4F5"/>
-          <w:bottom w:val="single" w:sz="2" w:space="0" w:color="F1F4F5"/>
-          <w:right w:val="single" w:sz="2" w:space="0" w:color="F1F4F5"/>
-        </w:pBdr>
-        <w:shd w:val="clear" w:color="auto" w:fill="FFFFFF"/>
-        <w:spacing w:after="0" w:line="240" w:lineRule="auto"/>
-        <w:rPr>
-          <w:rFonts w:ascii="Nunito" w:eastAsia="Times New Roman" w:hAnsi="Nunito" w:cs="Times New Roman"/>
-          <w:color w:val="000000"/>
-          <w:kern w:val="0"/>
-          <w:lang w:eastAsia="tr-TR"/>
-          <w14:ligatures w14:val="none"/>
-        </w:rPr>
-      </w:pPr>
-      <w:r>
-        <w:rPr>
-          <w:rFonts w:ascii="Lucida Sans Unicode" w:eastAsia="Times New Roman" w:hAnsi="Lucida Sans Unicode" w:cs="Lucida Sans Unicode"/>
-          <w:color w:val="000000"/>
-          <w:kern w:val="0"/>
-          <w:bdr w:val="single" w:sz="2" w:space="0" w:color="F1F4F5" w:frame="1"/>
-          <w:lang w:eastAsia="tr-TR"/>
-          <w14:ligatures w14:val="none"/>
-        </w:rPr>
-        <w:lastRenderedPageBreak/>
-        <w:t>-Metnin Yardımcı Düşünceleri</w:t>
-      </w:r>
-    </w:p>
-    <w:p>
-      <w:pPr>
-        <w:pBdr>
-          <w:top w:val="single" w:sz="2" w:space="0" w:color="F1F4F5"/>
-          <w:left w:val="single" w:sz="2" w:space="0" w:color="F1F4F5"/>
-          <w:bottom w:val="single" w:sz="2" w:space="0" w:color="F1F4F5"/>
-          <w:right w:val="single" w:sz="2" w:space="0" w:color="F1F4F5"/>
-        </w:pBdr>
-        <w:shd w:val="clear" w:color="auto" w:fill="FFFFFF"/>
-        <w:spacing w:after="0" w:line="240" w:lineRule="auto"/>
-        <w:rPr>
-          <w:rFonts w:ascii="Nunito" w:eastAsia="Times New Roman" w:hAnsi="Nunito" w:cs="Times New Roman"/>
-          <w:color w:val="000000"/>
-          <w:kern w:val="0"/>
-          <w:lang w:eastAsia="tr-TR"/>
-          <w14:ligatures w14:val="none"/>
-        </w:rPr>
-      </w:pPr>
-      <w:r>
-        <w:rPr>
-          <w:rFonts w:ascii="Lucida Sans Unicode" w:eastAsia="Times New Roman" w:hAnsi="Lucida Sans Unicode" w:cs="Lucida Sans Unicode"/>
-          <w:color w:val="000000"/>
-          <w:kern w:val="0"/>
-          <w:bdr w:val="single" w:sz="2" w:space="0" w:color="F1F4F5" w:frame="1"/>
-          <w:lang w:eastAsia="tr-TR"/>
-          <w14:ligatures w14:val="none"/>
-        </w:rPr>
-        <w:t>-Hikâye Unsurları, Anlatıcı Türleri, Gerçek ve Kurgusal Unsurlar</w:t>
-      </w:r>
-    </w:p>
-    <w:p>
-      <w:pPr>
-        <w:pBdr>
-          <w:top w:val="single" w:sz="2" w:space="0" w:color="F1F4F5"/>
-          <w:left w:val="single" w:sz="2" w:space="0" w:color="F1F4F5"/>
-          <w:bottom w:val="single" w:sz="2" w:space="0" w:color="F1F4F5"/>
-          <w:right w:val="single" w:sz="2" w:space="0" w:color="F1F4F5"/>
-        </w:pBdr>
-        <w:shd w:val="clear" w:color="auto" w:fill="FFFFFF"/>
-        <w:spacing w:after="0" w:line="240" w:lineRule="auto"/>
-        <w:rPr>
-          <w:rFonts w:ascii="Nunito" w:eastAsia="Times New Roman" w:hAnsi="Nunito" w:cs="Times New Roman"/>
-          <w:color w:val="000000"/>
-          <w:kern w:val="0"/>
-          <w:lang w:eastAsia="tr-TR"/>
-          <w14:ligatures w14:val="none"/>
-        </w:rPr>
-      </w:pPr>
-      <w:r>
-        <w:rPr>
-          <w:rFonts w:ascii="Lucida Sans Unicode" w:eastAsia="Times New Roman" w:hAnsi="Lucida Sans Unicode" w:cs="Lucida Sans Unicode"/>
-          <w:color w:val="000000"/>
-          <w:kern w:val="0"/>
-          <w:bdr w:val="single" w:sz="2" w:space="0" w:color="F1F4F5" w:frame="1"/>
-          <w:lang w:eastAsia="tr-TR"/>
-          <w14:ligatures w14:val="none"/>
-        </w:rPr>
-        <w:t>-Metinde Soru</w:t>
-      </w:r>
-    </w:p>
-    <w:p>
-      <w:pPr>
-        <w:pBdr>
-          <w:top w:val="single" w:sz="2" w:space="0" w:color="F1F4F5"/>
-          <w:left w:val="single" w:sz="2" w:space="0" w:color="F1F4F5"/>
-          <w:bottom w:val="single" w:sz="2" w:space="0" w:color="F1F4F5"/>
-          <w:right w:val="single" w:sz="2" w:space="0" w:color="F1F4F5"/>
-        </w:pBdr>
-        <w:shd w:val="clear" w:color="auto" w:fill="FFFFFF"/>
-        <w:spacing w:after="0" w:line="240" w:lineRule="auto"/>
-        <w:rPr>
-          <w:rFonts w:ascii="Nunito" w:eastAsia="Times New Roman" w:hAnsi="Nunito" w:cs="Times New Roman"/>
-          <w:color w:val="000000"/>
-          <w:kern w:val="0"/>
-          <w:lang w:eastAsia="tr-TR"/>
-          <w14:ligatures w14:val="none"/>
-        </w:rPr>
-      </w:pPr>
-      <w:r>
-        <w:rPr>
-          <w:rFonts w:ascii="Lucida Sans Unicode" w:eastAsia="Times New Roman" w:hAnsi="Lucida Sans Unicode" w:cs="Lucida Sans Unicode"/>
-          <w:color w:val="000000"/>
-          <w:kern w:val="0"/>
-          <w:bdr w:val="single" w:sz="2" w:space="0" w:color="F1F4F5" w:frame="1"/>
-          <w:lang w:eastAsia="tr-TR"/>
-          <w14:ligatures w14:val="none"/>
-        </w:rPr>
-        <w:t>-Metnin Bölümleri, Metin Oluşturma ve Metin Tamamlama</w:t>
-      </w:r>
-    </w:p>
-    <w:p>
-      <w:pPr>
-        <w:pBdr>
-          <w:top w:val="single" w:sz="2" w:space="0" w:color="F1F4F5"/>
-          <w:left w:val="single" w:sz="2" w:space="0" w:color="F1F4F5"/>
-          <w:bottom w:val="single" w:sz="2" w:space="0" w:color="F1F4F5"/>
-          <w:right w:val="single" w:sz="2" w:space="0" w:color="F1F4F5"/>
-        </w:pBdr>
-        <w:shd w:val="clear" w:color="auto" w:fill="FFFFFF"/>
-        <w:spacing w:after="0" w:line="240" w:lineRule="auto"/>
-        <w:rPr>
-          <w:rFonts w:ascii="Nunito" w:eastAsia="Times New Roman" w:hAnsi="Nunito" w:cs="Times New Roman"/>
-          <w:color w:val="000000"/>
-          <w:kern w:val="0"/>
-          <w:lang w:eastAsia="tr-TR"/>
-          <w14:ligatures w14:val="none"/>
-        </w:rPr>
-      </w:pPr>
-      <w:r>
-        <w:rPr>
-          <w:rFonts w:ascii="Lucida Sans Unicode" w:eastAsia="Times New Roman" w:hAnsi="Lucida Sans Unicode" w:cs="Lucida Sans Unicode"/>
-          <w:color w:val="000000"/>
-          <w:kern w:val="0"/>
-          <w:bdr w:val="single" w:sz="2" w:space="0" w:color="F1F4F5" w:frame="1"/>
-          <w:lang w:eastAsia="tr-TR"/>
-          <w14:ligatures w14:val="none"/>
-        </w:rPr>
-        <w:t>-Yönlendirici İfadeler</w:t>
-      </w:r>
-    </w:p>
-    <w:p>
-      <w:pPr>
-        <w:pBdr>
-          <w:top w:val="single" w:sz="2" w:space="0" w:color="F1F4F5"/>
-          <w:left w:val="single" w:sz="2" w:space="0" w:color="F1F4F5"/>
-          <w:bottom w:val="single" w:sz="2" w:space="0" w:color="F1F4F5"/>
-          <w:right w:val="single" w:sz="2" w:space="0" w:color="F1F4F5"/>
-        </w:pBdr>
-        <w:shd w:val="clear" w:color="auto" w:fill="FFFFFF"/>
-        <w:spacing w:after="0" w:line="240" w:lineRule="auto"/>
-        <w:rPr>
-          <w:rFonts w:ascii="Nunito" w:eastAsia="Times New Roman" w:hAnsi="Nunito" w:cs="Times New Roman"/>
-          <w:color w:val="000000"/>
-          <w:kern w:val="0"/>
-          <w:lang w:eastAsia="tr-TR"/>
-          <w14:ligatures w14:val="none"/>
-        </w:rPr>
-      </w:pPr>
-      <w:r>
-        <w:rPr>
-          <w:rFonts w:ascii="Lucida Sans Unicode" w:eastAsia="Times New Roman" w:hAnsi="Lucida Sans Unicode" w:cs="Lucida Sans Unicode"/>
-          <w:color w:val="000000"/>
-          <w:kern w:val="0"/>
-          <w:bdr w:val="single" w:sz="2" w:space="0" w:color="F1F4F5" w:frame="1"/>
-          <w:lang w:eastAsia="tr-TR"/>
-          <w14:ligatures w14:val="none"/>
-        </w:rPr>
-        <w:t>-Anlatıcı Biçimleri ve Düşünceyi Geliştirme Yolları</w:t>
-      </w:r>
-    </w:p>
-    <w:p>
-      <w:pPr>
-        <w:pBdr>
-          <w:top w:val="single" w:sz="2" w:space="0" w:color="F1F4F5"/>
-          <w:left w:val="single" w:sz="2" w:space="0" w:color="F1F4F5"/>
-          <w:bottom w:val="single" w:sz="2" w:space="0" w:color="F1F4F5"/>
-          <w:right w:val="single" w:sz="2" w:space="0" w:color="F1F4F5"/>
-        </w:pBdr>
-        <w:shd w:val="clear" w:color="auto" w:fill="FFFFFF"/>
-        <w:spacing w:after="0" w:line="240" w:lineRule="auto"/>
-        <w:rPr>
-          <w:rFonts w:ascii="Nunito" w:eastAsia="Times New Roman" w:hAnsi="Nunito" w:cs="Times New Roman"/>
-          <w:color w:val="000000"/>
-          <w:kern w:val="0"/>
-          <w:lang w:eastAsia="tr-TR"/>
-          <w14:ligatures w14:val="none"/>
-        </w:rPr>
-      </w:pPr>
-      <w:r>
-        <w:rPr>
-          <w:rFonts w:ascii="Lucida Sans Unicode" w:eastAsia="Times New Roman" w:hAnsi="Lucida Sans Unicode" w:cs="Lucida Sans Unicode"/>
-          <w:color w:val="000000"/>
-          <w:kern w:val="0"/>
-          <w:bdr w:val="single" w:sz="2" w:space="0" w:color="F1F4F5" w:frame="1"/>
-          <w:lang w:eastAsia="tr-TR"/>
-          <w14:ligatures w14:val="none"/>
-        </w:rPr>
-        <w:t>-Metnin Dil Anlatım ve Özellikleri</w:t>
-      </w:r>
-    </w:p>
-    <w:p>
-      <w:pPr>
-        <w:pBdr>
-          <w:top w:val="single" w:sz="2" w:space="0" w:color="F1F4F5"/>
-          <w:left w:val="single" w:sz="2" w:space="0" w:color="F1F4F5"/>
-          <w:bottom w:val="single" w:sz="2" w:space="0" w:color="F1F4F5"/>
-          <w:right w:val="single" w:sz="2" w:space="0" w:color="F1F4F5"/>
-        </w:pBdr>
-        <w:shd w:val="clear" w:color="auto" w:fill="FFFFFF"/>
-        <w:spacing w:after="0" w:line="240" w:lineRule="auto"/>
-        <w:rPr>
-          <w:rFonts w:ascii="Nunito" w:eastAsia="Times New Roman" w:hAnsi="Nunito" w:cs="Times New Roman"/>
-          <w:color w:val="000000"/>
-          <w:kern w:val="0"/>
-          <w:lang w:eastAsia="tr-TR"/>
-          <w14:ligatures w14:val="none"/>
-        </w:rPr>
-      </w:pPr>
-      <w:r>
-        <w:rPr>
-          <w:rFonts w:ascii="Lucida Sans Unicode" w:eastAsia="Times New Roman" w:hAnsi="Lucida Sans Unicode" w:cs="Lucida Sans Unicode"/>
-          <w:color w:val="000000"/>
-          <w:kern w:val="0"/>
-          <w:bdr w:val="single" w:sz="2" w:space="0" w:color="F1F4F5" w:frame="1"/>
-          <w:lang w:eastAsia="tr-TR"/>
-          <w14:ligatures w14:val="none"/>
-        </w:rPr>
-        <w:t>-Metin Karşılaştırma</w:t>
-      </w:r>
-    </w:p>
-    <w:p>
-      <w:pPr>
-        <w:pBdr>
-          <w:top w:val="single" w:sz="2" w:space="0" w:color="F1F4F5"/>
-          <w:left w:val="single" w:sz="2" w:space="0" w:color="F1F4F5"/>
-          <w:bottom w:val="single" w:sz="2" w:space="0" w:color="F1F4F5"/>
-          <w:right w:val="single" w:sz="2" w:space="0" w:color="F1F4F5"/>
-        </w:pBdr>
-        <w:shd w:val="clear" w:color="auto" w:fill="FFFFFF"/>
-        <w:spacing w:after="0" w:line="240" w:lineRule="auto"/>
-        <w:rPr>
-          <w:rFonts w:ascii="Nunito" w:eastAsia="Times New Roman" w:hAnsi="Nunito" w:cs="Times New Roman"/>
-          <w:color w:val="000000"/>
-          <w:kern w:val="0"/>
-          <w:lang w:eastAsia="tr-TR"/>
-          <w14:ligatures w14:val="none"/>
-        </w:rPr>
-      </w:pPr>
-      <w:r>
-        <w:rPr>
-          <w:rFonts w:ascii="Lucida Sans Unicode" w:eastAsia="Times New Roman" w:hAnsi="Lucida Sans Unicode" w:cs="Lucida Sans Unicode"/>
-          <w:color w:val="000000"/>
-          <w:kern w:val="0"/>
-          <w:bdr w:val="single" w:sz="2" w:space="0" w:color="F1F4F5" w:frame="1"/>
-          <w:lang w:eastAsia="tr-TR"/>
-          <w14:ligatures w14:val="none"/>
-        </w:rPr>
-        <w:t>-Görsel Yorumlama ve Grafik Okuma</w:t>
-      </w:r>
-    </w:p>
-    <w:p>
-      <w:pPr>
-        <w:pBdr>
-          <w:top w:val="single" w:sz="2" w:space="0" w:color="F1F4F5"/>
-          <w:left w:val="single" w:sz="2" w:space="0" w:color="F1F4F5"/>
-          <w:bottom w:val="single" w:sz="2" w:space="0" w:color="F1F4F5"/>
-          <w:right w:val="single" w:sz="2" w:space="0" w:color="F1F4F5"/>
-        </w:pBdr>
-        <w:shd w:val="clear" w:color="auto" w:fill="FFFFFF"/>
-        <w:spacing w:after="0" w:line="240" w:lineRule="auto"/>
-        <w:outlineLvl w:val="2"/>
-        <w:rPr>
-          <w:rFonts w:ascii="Nunito" w:eastAsia="Times New Roman" w:hAnsi="Nunito" w:cs="Times New Roman"/>
-          <w:b/>
-          <w:bCs/>
-          <w:color w:val="000000"/>
-          <w:kern w:val="0"/>
-          <w:lang w:eastAsia="tr-TR"/>
-          <w14:ligatures w14:val="none"/>
-        </w:rPr>
-      </w:pPr>
+        <w:t>3</w:t>
+      </w:r>
       <w:r>
         <w:rPr>
           <w:rFonts w:ascii="inherit" w:eastAsia="Times New Roman" w:hAnsi="inherit" w:cs="Lucida Sans Unicode"/>
@@ -2570,157 +2023,67 @@
           <w:lang w:eastAsia="tr-TR"/>
           <w14:ligatures w14:val="none"/>
         </w:rPr>
-        <w:t>Fiiller</w:t>
-      </w:r>
-    </w:p>
-    <w:p>
-      <w:pPr>
-        <w:pBdr>
-          <w:top w:val="single" w:sz="2" w:space="0" w:color="F1F4F5"/>
-          <w:left w:val="single" w:sz="2" w:space="0" w:color="F1F4F5"/>
-          <w:bottom w:val="single" w:sz="2" w:space="0" w:color="F1F4F5"/>
-          <w:right w:val="single" w:sz="2" w:space="0" w:color="F1F4F5"/>
-        </w:pBdr>
-        <w:shd w:val="clear" w:color="auto" w:fill="FFFFFF"/>
-        <w:spacing w:after="0" w:line="240" w:lineRule="auto"/>
-        <w:rPr>
-          <w:rFonts w:ascii="Nunito" w:eastAsia="Times New Roman" w:hAnsi="Nunito" w:cs="Times New Roman"/>
-          <w:color w:val="000000"/>
-          <w:kern w:val="0"/>
-          <w:lang w:eastAsia="tr-TR"/>
-          <w14:ligatures w14:val="none"/>
-        </w:rPr>
-      </w:pPr>
-      <w:r>
-        <w:rPr>
-          <w:rFonts w:ascii="Lucida Sans Unicode" w:eastAsia="Times New Roman" w:hAnsi="Lucida Sans Unicode" w:cs="Lucida Sans Unicode"/>
-          <w:color w:val="000000"/>
-          <w:kern w:val="0"/>
-          <w:bdr w:val="single" w:sz="2" w:space="0" w:color="F1F4F5" w:frame="1"/>
-          <w:lang w:eastAsia="tr-TR"/>
-          <w14:ligatures w14:val="none"/>
-        </w:rPr>
-        <w:t>-Fiillerin Anlam Özellikleri</w:t>
-      </w:r>
-    </w:p>
-    <w:p>
-      <w:pPr>
-        <w:pBdr>
-          <w:top w:val="single" w:sz="2" w:space="0" w:color="F1F4F5"/>
-          <w:left w:val="single" w:sz="2" w:space="0" w:color="F1F4F5"/>
-          <w:bottom w:val="single" w:sz="2" w:space="0" w:color="F1F4F5"/>
-          <w:right w:val="single" w:sz="2" w:space="0" w:color="F1F4F5"/>
-        </w:pBdr>
-        <w:shd w:val="clear" w:color="auto" w:fill="FFFFFF"/>
-        <w:spacing w:after="0" w:line="240" w:lineRule="auto"/>
-        <w:rPr>
-          <w:rFonts w:ascii="Nunito" w:eastAsia="Times New Roman" w:hAnsi="Nunito" w:cs="Times New Roman"/>
-          <w:color w:val="000000"/>
-          <w:kern w:val="0"/>
-          <w:lang w:eastAsia="tr-TR"/>
-          <w14:ligatures w14:val="none"/>
-        </w:rPr>
-      </w:pPr>
-      <w:r>
-        <w:rPr>
-          <w:rFonts w:ascii="Lucida Sans Unicode" w:eastAsia="Times New Roman" w:hAnsi="Lucida Sans Unicode" w:cs="Lucida Sans Unicode"/>
-          <w:color w:val="000000"/>
-          <w:kern w:val="0"/>
-          <w:bdr w:val="single" w:sz="2" w:space="0" w:color="F1F4F5" w:frame="1"/>
-          <w:lang w:eastAsia="tr-TR"/>
-          <w14:ligatures w14:val="none"/>
-        </w:rPr>
-        <w:t>-Haber Kipleri, Dilek Kipleri ve Kişi Ekleri</w:t>
-      </w:r>
-    </w:p>
-    <w:p>
-      <w:pPr>
-        <w:pBdr>
-          <w:top w:val="single" w:sz="2" w:space="0" w:color="F1F4F5"/>
-          <w:left w:val="single" w:sz="2" w:space="0" w:color="F1F4F5"/>
-          <w:bottom w:val="single" w:sz="2" w:space="0" w:color="F1F4F5"/>
-          <w:right w:val="single" w:sz="2" w:space="0" w:color="F1F4F5"/>
-        </w:pBdr>
-        <w:shd w:val="clear" w:color="auto" w:fill="FFFFFF"/>
-        <w:spacing w:after="0" w:line="240" w:lineRule="auto"/>
-        <w:rPr>
-          <w:rFonts w:ascii="Nunito" w:eastAsia="Times New Roman" w:hAnsi="Nunito" w:cs="Times New Roman"/>
-          <w:color w:val="000000"/>
-          <w:kern w:val="0"/>
-          <w:lang w:eastAsia="tr-TR"/>
-          <w14:ligatures w14:val="none"/>
-        </w:rPr>
-      </w:pPr>
-      <w:r>
-        <w:rPr>
-          <w:rFonts w:ascii="Lucida Sans Unicode" w:eastAsia="Times New Roman" w:hAnsi="Lucida Sans Unicode" w:cs="Lucida Sans Unicode"/>
-          <w:color w:val="000000"/>
-          <w:kern w:val="0"/>
-          <w:bdr w:val="single" w:sz="2" w:space="0" w:color="F1F4F5" w:frame="1"/>
-          <w:lang w:eastAsia="tr-TR"/>
-          <w14:ligatures w14:val="none"/>
-        </w:rPr>
-        <w:t>-Fiillerde Olumsuz, Soru Çekimi ve Anlam Kayması</w:t>
-      </w:r>
-    </w:p>
-    <w:p>
-      <w:pPr>
-        <w:pBdr>
-          <w:top w:val="single" w:sz="2" w:space="0" w:color="F1F4F5"/>
-          <w:left w:val="single" w:sz="2" w:space="0" w:color="F1F4F5"/>
-          <w:bottom w:val="single" w:sz="2" w:space="0" w:color="F1F4F5"/>
-          <w:right w:val="single" w:sz="2" w:space="0" w:color="F1F4F5"/>
-        </w:pBdr>
-        <w:shd w:val="clear" w:color="auto" w:fill="FFFFFF"/>
-        <w:spacing w:after="0" w:line="240" w:lineRule="auto"/>
-        <w:rPr>
-          <w:rFonts w:ascii="Nunito" w:eastAsia="Times New Roman" w:hAnsi="Nunito" w:cs="Times New Roman"/>
-          <w:color w:val="000000"/>
-          <w:kern w:val="0"/>
-          <w:lang w:eastAsia="tr-TR"/>
-          <w14:ligatures w14:val="none"/>
-        </w:rPr>
-      </w:pPr>
-      <w:r>
-        <w:rPr>
-          <w:rFonts w:ascii="Lucida Sans Unicode" w:eastAsia="Times New Roman" w:hAnsi="Lucida Sans Unicode" w:cs="Lucida Sans Unicode"/>
-          <w:color w:val="000000"/>
-          <w:kern w:val="0"/>
-          <w:bdr w:val="single" w:sz="2" w:space="0" w:color="F1F4F5" w:frame="1"/>
-          <w:lang w:eastAsia="tr-TR"/>
-          <w14:ligatures w14:val="none"/>
-        </w:rPr>
-        <w:t>-Fiillerde Yapı</w:t>
-      </w:r>
-    </w:p>
-    <w:p>
-      <w:pPr>
-        <w:pBdr>
-          <w:top w:val="single" w:sz="2" w:space="0" w:color="F1F4F5"/>
-          <w:left w:val="single" w:sz="2" w:space="0" w:color="F1F4F5"/>
-          <w:bottom w:val="single" w:sz="2" w:space="0" w:color="F1F4F5"/>
-          <w:right w:val="single" w:sz="2" w:space="0" w:color="F1F4F5"/>
-        </w:pBdr>
-        <w:shd w:val="clear" w:color="auto" w:fill="FFFFFF"/>
-        <w:spacing w:after="0" w:line="240" w:lineRule="auto"/>
-        <w:rPr>
-          <w:rFonts w:ascii="Nunito" w:eastAsia="Times New Roman" w:hAnsi="Nunito" w:cs="Times New Roman"/>
-          <w:color w:val="000000"/>
-          <w:kern w:val="0"/>
-          <w:lang w:eastAsia="tr-TR"/>
-          <w14:ligatures w14:val="none"/>
-        </w:rPr>
-      </w:pPr>
-      <w:r>
-        <w:rPr>
-          <w:rFonts w:ascii="Lucida Sans Unicode" w:eastAsia="Times New Roman" w:hAnsi="Lucida Sans Unicode" w:cs="Lucida Sans Unicode"/>
-          <w:color w:val="000000"/>
-          <w:kern w:val="0"/>
-          <w:bdr w:val="single" w:sz="2" w:space="0" w:color="F1F4F5" w:frame="1"/>
-          <w:lang w:eastAsia="tr-TR"/>
-          <w14:ligatures w14:val="none"/>
-        </w:rPr>
-        <w:t>-Ek Fiil</w:t>
+        <w:t>Deyimler ve Atasözleri</w:t>
+      </w:r>
+    </w:p>
+    <w:p>
+      <w:pPr>
+        <w:pBdr>
+          <w:top w:val="single" w:sz="2" w:space="0" w:color="F1F4F5"/>
+          <w:left w:val="single" w:sz="2" w:space="0" w:color="F1F4F5"/>
+          <w:bottom w:val="single" w:sz="2" w:space="0" w:color="F1F4F5"/>
+          <w:right w:val="single" w:sz="2" w:space="0" w:color="F1F4F5"/>
+        </w:pBdr>
+        <w:shd w:val="clear" w:color="auto" w:fill="FFFFFF"/>
+        <w:spacing w:after="0" w:line="240" w:lineRule="auto"/>
+        <w:rPr>
+          <w:rFonts w:ascii="Nunito" w:eastAsia="Times New Roman" w:hAnsi="Nunito" w:cs="Times New Roman"/>
+          <w:color w:val="000000"/>
+          <w:kern w:val="0"/>
+          <w:lang w:eastAsia="tr-TR"/>
+          <w14:ligatures w14:val="none"/>
+        </w:rPr>
+      </w:pPr>
+      <w:r>
+        <w:rPr>
+          <w:rFonts w:ascii="inherit" w:eastAsia="Times New Roman" w:hAnsi="inherit" w:cs="Lucida Sans Unicode"/>
+          <w:color w:val="000000"/>
+          <w:kern w:val="0"/>
+          <w:bdr w:val="single" w:sz="2" w:space="0" w:color="F1F4F5" w:frame="1"/>
+          <w:lang w:eastAsia="tr-TR"/>
+          <w14:ligatures w14:val="none"/>
+        </w:rPr>
+        <w:t>-Atasözleri ve Özdeyişler</w:t>
+      </w:r>
+    </w:p>
+    <w:p>
+      <w:pPr>
+        <w:pBdr>
+          <w:top w:val="single" w:sz="2" w:space="0" w:color="F1F4F5"/>
+          <w:left w:val="single" w:sz="2" w:space="0" w:color="F1F4F5"/>
+          <w:bottom w:val="single" w:sz="2" w:space="0" w:color="F1F4F5"/>
+          <w:right w:val="single" w:sz="2" w:space="0" w:color="F1F4F5"/>
+        </w:pBdr>
+        <w:shd w:val="clear" w:color="auto" w:fill="FFFFFF"/>
+        <w:spacing w:after="0" w:line="240" w:lineRule="auto"/>
+        <w:rPr>
+          <w:rFonts w:ascii="Nunito" w:eastAsia="Times New Roman" w:hAnsi="Nunito" w:cs="Times New Roman"/>
+          <w:color w:val="000000"/>
+          <w:kern w:val="0"/>
+          <w:lang w:eastAsia="tr-TR"/>
+          <w14:ligatures w14:val="none"/>
+        </w:rPr>
+      </w:pPr>
+      <w:r>
+        <w:rPr>
+          <w:rFonts w:ascii="inherit" w:eastAsia="Times New Roman" w:hAnsi="inherit" w:cs="Lucida Sans Unicode"/>
+          <w:color w:val="000000"/>
+          <w:kern w:val="0"/>
+          <w:bdr w:val="single" w:sz="2" w:space="0" w:color="F1F4F5" w:frame="1"/>
+          <w:lang w:eastAsia="tr-TR"/>
+          <w14:ligatures w14:val="none"/>
+        </w:rPr>
+        <w:t>-Deyimler</w:t>
       </w:r>
     </w:p>
     <w:p>
@@ -2757,60 +2120,8 @@
           <w:lang w:eastAsia="tr-TR"/>
           <w14:ligatures w14:val="none"/>
         </w:rPr>
-        <w:t>Zarflar</w:t>
-      </w:r>
-    </w:p>
-    <w:p>
-      <w:pPr>
-        <w:pBdr>
-          <w:top w:val="single" w:sz="2" w:space="0" w:color="F1F4F5"/>
-          <w:left w:val="single" w:sz="2" w:space="0" w:color="F1F4F5"/>
-          <w:bottom w:val="single" w:sz="2" w:space="0" w:color="F1F4F5"/>
-          <w:right w:val="single" w:sz="2" w:space="0" w:color="F1F4F5"/>
-        </w:pBdr>
-        <w:shd w:val="clear" w:color="auto" w:fill="FFFFFF"/>
-        <w:spacing w:after="0" w:line="240" w:lineRule="auto"/>
-        <w:rPr>
-          <w:rFonts w:ascii="Nunito" w:eastAsia="Times New Roman" w:hAnsi="Nunito" w:cs="Times New Roman"/>
-          <w:color w:val="000000"/>
-          <w:kern w:val="0"/>
-          <w:lang w:eastAsia="tr-TR"/>
-          <w14:ligatures w14:val="none"/>
-        </w:rPr>
-      </w:pPr>
-      <w:r>
-        <w:rPr>
-          <w:rFonts w:ascii="Lucida Sans Unicode" w:eastAsia="Times New Roman" w:hAnsi="Lucida Sans Unicode" w:cs="Lucida Sans Unicode"/>
-          <w:color w:val="000000"/>
-          <w:kern w:val="0"/>
-          <w:bdr w:val="single" w:sz="2" w:space="0" w:color="F1F4F5" w:frame="1"/>
-          <w:lang w:eastAsia="tr-TR"/>
-          <w14:ligatures w14:val="none"/>
-        </w:rPr>
-        <w:t>-Durum, Zaman, Yer Yön, Miktar ve Soru Zarfları</w:t>
-      </w:r>
-    </w:p>
-    <w:p>
-      <w:pPr>
-        <w:pBdr>
-          <w:top w:val="single" w:sz="2" w:space="0" w:color="F1F4F5"/>
-          <w:left w:val="single" w:sz="2" w:space="0" w:color="F1F4F5"/>
-          <w:bottom w:val="single" w:sz="2" w:space="0" w:color="F1F4F5"/>
-          <w:right w:val="single" w:sz="2" w:space="0" w:color="F1F4F5"/>
-        </w:pBdr>
-        <w:shd w:val="clear" w:color="auto" w:fill="FFFFFF"/>
-        <w:spacing w:after="0" w:line="240" w:lineRule="auto"/>
-        <w:outlineLvl w:val="2"/>
-        <w:rPr>
-          <w:rFonts w:ascii="Nunito" w:eastAsia="Times New Roman" w:hAnsi="Nunito" w:cs="Times New Roman"/>
-          <w:b/>
-          <w:bCs/>
-          <w:color w:val="000000"/>
-          <w:kern w:val="0"/>
-          <w:lang w:eastAsia="tr-TR"/>
-          <w14:ligatures w14:val="none"/>
-        </w:rPr>
-      </w:pPr>
+        <w:t>4</w:t>
+      </w:r>
       <w:r>
         <w:rPr>
           <w:rFonts w:ascii="inherit" w:eastAsia="Times New Roman" w:hAnsi="inherit" w:cs="Lucida Sans Unicode"/>
@@ -2824,37 +2135,67 @@
           <w:lang w:eastAsia="tr-TR"/>
           <w14:ligatures w14:val="none"/>
         </w:rPr>
-        <w:t>Anlatım Bozuklukları</w:t>
-      </w:r>
-    </w:p>
-    <w:p>
-      <w:pPr>
-        <w:pBdr>
-          <w:top w:val="single" w:sz="2" w:space="0" w:color="F1F4F5"/>
-          <w:left w:val="single" w:sz="2" w:space="0" w:color="F1F4F5"/>
-          <w:bottom w:val="single" w:sz="2" w:space="0" w:color="F1F4F5"/>
-          <w:right w:val="single" w:sz="2" w:space="0" w:color="F1F4F5"/>
-        </w:pBdr>
-        <w:shd w:val="clear" w:color="auto" w:fill="FFFFFF"/>
-        <w:spacing w:after="0" w:line="240" w:lineRule="auto"/>
-        <w:rPr>
-          <w:rFonts w:ascii="Nunito" w:eastAsia="Times New Roman" w:hAnsi="Nunito" w:cs="Times New Roman"/>
-          <w:color w:val="000000"/>
-          <w:kern w:val="0"/>
-          <w:lang w:eastAsia="tr-TR"/>
-          <w14:ligatures w14:val="none"/>
-        </w:rPr>
-      </w:pPr>
-      <w:r>
-        <w:rPr>
-          <w:rFonts w:ascii="Lucida Sans Unicode" w:eastAsia="Times New Roman" w:hAnsi="Lucida Sans Unicode" w:cs="Lucida Sans Unicode"/>
-          <w:color w:val="000000"/>
-          <w:kern w:val="0"/>
-          <w:bdr w:val="single" w:sz="2" w:space="0" w:color="F1F4F5" w:frame="1"/>
-          <w:lang w:eastAsia="tr-TR"/>
-          <w14:ligatures w14:val="none"/>
-        </w:rPr>
-        <w:t>-Anlatım Bozuklukları</w:t>
+        <w:t>Söz Sanatları</w:t>
+      </w:r>
+    </w:p>
+    <w:p>
+      <w:pPr>
+        <w:pBdr>
+          <w:top w:val="single" w:sz="2" w:space="0" w:color="F1F4F5"/>
+          <w:left w:val="single" w:sz="2" w:space="0" w:color="F1F4F5"/>
+          <w:bottom w:val="single" w:sz="2" w:space="0" w:color="F1F4F5"/>
+          <w:right w:val="single" w:sz="2" w:space="0" w:color="F1F4F5"/>
+        </w:pBdr>
+        <w:shd w:val="clear" w:color="auto" w:fill="FFFFFF"/>
+        <w:spacing w:after="0" w:line="240" w:lineRule="auto"/>
+        <w:rPr>
+          <w:rFonts w:ascii="Nunito" w:eastAsia="Times New Roman" w:hAnsi="Nunito" w:cs="Times New Roman"/>
+          <w:color w:val="000000"/>
+          <w:kern w:val="0"/>
+          <w:lang w:eastAsia="tr-TR"/>
+          <w14:ligatures w14:val="none"/>
+        </w:rPr>
+      </w:pPr>
+      <w:r>
+        <w:rPr>
+          <w:rFonts w:ascii="Lucida Sans Unicode" w:eastAsia="Times New Roman" w:hAnsi="Lucida Sans Unicode" w:cs="Lucida Sans Unicode"/>
+          <w:color w:val="000000"/>
+          <w:kern w:val="0"/>
+          <w:bdr w:val="single" w:sz="2" w:space="0" w:color="F1F4F5" w:frame="1"/>
+          <w:lang w:eastAsia="tr-TR"/>
+          <w14:ligatures w14:val="none"/>
+        </w:rPr>
+        <w:t>-Karşıtlık, Abartma, Konuşturma ve Kişileştirme</w:t>
+      </w:r>
+    </w:p>
+    <w:p>
+      <w:pPr>
+        <w:pBdr>
+          <w:top w:val="single" w:sz="2" w:space="0" w:color="F1F4F5"/>
+          <w:left w:val="single" w:sz="2" w:space="0" w:color="F1F4F5"/>
+          <w:bottom w:val="single" w:sz="2" w:space="0" w:color="F1F4F5"/>
+          <w:right w:val="single" w:sz="2" w:space="0" w:color="F1F4F5"/>
+        </w:pBdr>
+        <w:shd w:val="clear" w:color="auto" w:fill="FFFFFF"/>
+        <w:spacing w:after="0" w:line="240" w:lineRule="auto"/>
+        <w:rPr>
+          <w:rFonts w:ascii="Nunito" w:eastAsia="Times New Roman" w:hAnsi="Nunito" w:cs="Times New Roman"/>
+          <w:color w:val="000000"/>
+          <w:kern w:val="0"/>
+          <w:lang w:eastAsia="tr-TR"/>
+          <w14:ligatures w14:val="none"/>
+        </w:rPr>
+      </w:pPr>
+      <w:r>
+        <w:rPr>
+          <w:rFonts w:ascii="Lucida Sans Unicode" w:eastAsia="Times New Roman" w:hAnsi="Lucida Sans Unicode" w:cs="Lucida Sans Unicode"/>
+          <w:color w:val="000000"/>
+          <w:kern w:val="0"/>
+          <w:bdr w:val="single" w:sz="2" w:space="0" w:color="F1F4F5" w:frame="1"/>
+          <w:lang w:eastAsia="tr-TR"/>
+          <w14:ligatures w14:val="none"/>
+        </w:rPr>
+        <w:t>-Söyleşi, Günlük, Otobiyografi ve Biyografi</w:t>
       </w:r>
     </w:p>
     <w:p>
@@ -2891,174 +2232,8 @@
           <w:lang w:eastAsia="tr-TR"/>
           <w14:ligatures w14:val="none"/>
         </w:rPr>
-        <w:t>Yazım Kuralları</w:t>
-      </w:r>
-    </w:p>
-    <w:p>
-      <w:pPr>
-        <w:pBdr>
-          <w:top w:val="single" w:sz="2" w:space="0" w:color="F1F4F5"/>
-          <w:left w:val="single" w:sz="2" w:space="0" w:color="F1F4F5"/>
-          <w:bottom w:val="single" w:sz="2" w:space="0" w:color="F1F4F5"/>
-          <w:right w:val="single" w:sz="2" w:space="0" w:color="F1F4F5"/>
-        </w:pBdr>
-        <w:shd w:val="clear" w:color="auto" w:fill="FFFFFF"/>
-        <w:spacing w:after="0" w:line="240" w:lineRule="auto"/>
-        <w:rPr>
-          <w:rFonts w:ascii="Nunito" w:eastAsia="Times New Roman" w:hAnsi="Nunito" w:cs="Times New Roman"/>
-          <w:color w:val="000000"/>
-          <w:kern w:val="0"/>
-          <w:lang w:eastAsia="tr-TR"/>
-          <w14:ligatures w14:val="none"/>
-        </w:rPr>
-      </w:pPr>
-      <w:r>
-        <w:rPr>
-          <w:rFonts w:ascii="Lucida Sans Unicode" w:eastAsia="Times New Roman" w:hAnsi="Lucida Sans Unicode" w:cs="Lucida Sans Unicode"/>
-          <w:color w:val="000000"/>
-          <w:kern w:val="0"/>
-          <w:bdr w:val="single" w:sz="2" w:space="0" w:color="F1F4F5" w:frame="1"/>
-          <w:lang w:eastAsia="tr-TR"/>
-          <w14:ligatures w14:val="none"/>
-        </w:rPr>
-        <w:t>-Büyük Harflerin Kullanıldığı Yerler</w:t>
-      </w:r>
-    </w:p>
-    <w:p>
-      <w:pPr>
-        <w:pBdr>
-          <w:top w:val="single" w:sz="2" w:space="0" w:color="F1F4F5"/>
-          <w:left w:val="single" w:sz="2" w:space="0" w:color="F1F4F5"/>
-          <w:bottom w:val="single" w:sz="2" w:space="0" w:color="F1F4F5"/>
-          <w:right w:val="single" w:sz="2" w:space="0" w:color="F1F4F5"/>
-        </w:pBdr>
-        <w:shd w:val="clear" w:color="auto" w:fill="FFFFFF"/>
-        <w:spacing w:after="0" w:line="240" w:lineRule="auto"/>
-        <w:rPr>
-          <w:rFonts w:ascii="Nunito" w:eastAsia="Times New Roman" w:hAnsi="Nunito" w:cs="Times New Roman"/>
-          <w:color w:val="000000"/>
-          <w:kern w:val="0"/>
-          <w:lang w:eastAsia="tr-TR"/>
-          <w14:ligatures w14:val="none"/>
-        </w:rPr>
-      </w:pPr>
-      <w:r>
-        <w:rPr>
-          <w:rFonts w:ascii="Lucida Sans Unicode" w:eastAsia="Times New Roman" w:hAnsi="Lucida Sans Unicode" w:cs="Lucida Sans Unicode"/>
-          <w:color w:val="000000"/>
-          <w:kern w:val="0"/>
-          <w:bdr w:val="single" w:sz="2" w:space="0" w:color="F1F4F5" w:frame="1"/>
-          <w:lang w:eastAsia="tr-TR"/>
-          <w14:ligatures w14:val="none"/>
-        </w:rPr>
-        <w:t xml:space="preserve">-De, Ki ve </w:t>
-      </w:r>
-      <w:proofErr w:type="spellStart"/>
-      <w:r>
-        <w:rPr>
-          <w:rFonts w:ascii="Lucida Sans Unicode" w:eastAsia="Times New Roman" w:hAnsi="Lucida Sans Unicode" w:cs="Lucida Sans Unicode"/>
-          <w:color w:val="000000"/>
-          <w:kern w:val="0"/>
-          <w:bdr w:val="single" w:sz="2" w:space="0" w:color="F1F4F5" w:frame="1"/>
-          <w:lang w:eastAsia="tr-TR"/>
-          <w14:ligatures w14:val="none"/>
-        </w:rPr>
-        <w:t>Mi’nin</w:t>
-      </w:r>
-      <w:proofErr w:type="spellEnd"/>
-      <w:r>
-        <w:rPr>
-          <w:rFonts w:ascii="Lucida Sans Unicode" w:eastAsia="Times New Roman" w:hAnsi="Lucida Sans Unicode" w:cs="Lucida Sans Unicode"/>
-          <w:color w:val="000000"/>
-          <w:kern w:val="0"/>
-          <w:bdr w:val="single" w:sz="2" w:space="0" w:color="F1F4F5" w:frame="1"/>
-          <w:lang w:eastAsia="tr-TR"/>
-          <w14:ligatures w14:val="none"/>
-        </w:rPr>
-        <w:t xml:space="preserve"> Yazımı</w:t>
-      </w:r>
-    </w:p>
-    <w:p>
-      <w:pPr>
-        <w:pBdr>
-          <w:top w:val="single" w:sz="2" w:space="0" w:color="F1F4F5"/>
-          <w:left w:val="single" w:sz="2" w:space="0" w:color="F1F4F5"/>
-          <w:bottom w:val="single" w:sz="2" w:space="0" w:color="F1F4F5"/>
-          <w:right w:val="single" w:sz="2" w:space="0" w:color="F1F4F5"/>
-        </w:pBdr>
-        <w:shd w:val="clear" w:color="auto" w:fill="FFFFFF"/>
-        <w:spacing w:after="0" w:line="240" w:lineRule="auto"/>
-        <w:rPr>
-          <w:rFonts w:ascii="Nunito" w:eastAsia="Times New Roman" w:hAnsi="Nunito" w:cs="Times New Roman"/>
-          <w:color w:val="000000"/>
-          <w:kern w:val="0"/>
-          <w:lang w:eastAsia="tr-TR"/>
-          <w14:ligatures w14:val="none"/>
-        </w:rPr>
-      </w:pPr>
-      <w:r>
-        <w:rPr>
-          <w:rFonts w:ascii="Lucida Sans Unicode" w:eastAsia="Times New Roman" w:hAnsi="Lucida Sans Unicode" w:cs="Lucida Sans Unicode"/>
-          <w:color w:val="000000"/>
-          <w:kern w:val="0"/>
-          <w:bdr w:val="single" w:sz="2" w:space="0" w:color="F1F4F5" w:frame="1"/>
-          <w:lang w:eastAsia="tr-TR"/>
-          <w14:ligatures w14:val="none"/>
-        </w:rPr>
-        <w:t>-Birleşik Kelimelerin Yazımı</w:t>
-      </w:r>
-    </w:p>
-    <w:p>
-      <w:pPr>
-        <w:pBdr>
-          <w:top w:val="single" w:sz="2" w:space="0" w:color="F1F4F5"/>
-          <w:left w:val="single" w:sz="2" w:space="0" w:color="F1F4F5"/>
-          <w:bottom w:val="single" w:sz="2" w:space="0" w:color="F1F4F5"/>
-          <w:right w:val="single" w:sz="2" w:space="0" w:color="F1F4F5"/>
-        </w:pBdr>
-        <w:shd w:val="clear" w:color="auto" w:fill="FFFFFF"/>
-        <w:spacing w:after="0" w:line="240" w:lineRule="auto"/>
-        <w:rPr>
-          <w:rFonts w:ascii="Nunito" w:eastAsia="Times New Roman" w:hAnsi="Nunito" w:cs="Times New Roman"/>
-          <w:color w:val="000000"/>
-          <w:kern w:val="0"/>
-          <w:lang w:eastAsia="tr-TR"/>
-          <w14:ligatures w14:val="none"/>
-        </w:rPr>
-      </w:pPr>
-      <w:r>
-        <w:rPr>
-          <w:rFonts w:ascii="Lucida Sans Unicode" w:eastAsia="Times New Roman" w:hAnsi="Lucida Sans Unicode" w:cs="Lucida Sans Unicode"/>
-          <w:color w:val="000000"/>
-          <w:kern w:val="0"/>
-          <w:bdr w:val="single" w:sz="2" w:space="0" w:color="F1F4F5" w:frame="1"/>
-          <w:lang w:eastAsia="tr-TR"/>
-          <w14:ligatures w14:val="none"/>
-        </w:rPr>
-        <w:t>-Kısaltma, Sayıların Yazımı ve Yazımı Karıştırılan Sözcükler</w:t>
-      </w:r>
-    </w:p>
-    <w:p>
-      <w:pPr>
-        <w:pBdr>
-          <w:top w:val="single" w:sz="2" w:space="0" w:color="F1F4F5"/>
-          <w:left w:val="single" w:sz="2" w:space="0" w:color="F1F4F5"/>
-          <w:bottom w:val="single" w:sz="2" w:space="0" w:color="F1F4F5"/>
-          <w:right w:val="single" w:sz="2" w:space="0" w:color="F1F4F5"/>
-        </w:pBdr>
-        <w:shd w:val="clear" w:color="auto" w:fill="FFFFFF"/>
-        <w:spacing w:after="0" w:line="240" w:lineRule="auto"/>
-        <w:outlineLvl w:val="2"/>
-        <w:rPr>
-          <w:rFonts w:ascii="Nunito" w:eastAsia="Times New Roman" w:hAnsi="Nunito" w:cs="Times New Roman"/>
-          <w:b/>
-          <w:bCs/>
-          <w:color w:val="000000"/>
-          <w:kern w:val="0"/>
-          <w:lang w:eastAsia="tr-TR"/>
-          <w14:ligatures w14:val="none"/>
-        </w:rPr>
-      </w:pPr>
+        <w:t>5</w:t>
+      </w:r>
       <w:r>
         <w:rPr>
           <w:rFonts w:ascii="inherit" w:eastAsia="Times New Roman" w:hAnsi="inherit" w:cs="Lucida Sans Unicode"/>
@@ -3072,91 +2247,368 @@
           <w:lang w:eastAsia="tr-TR"/>
           <w14:ligatures w14:val="none"/>
         </w:rPr>
-        <w:t>Noktalama İşaretleri</w:t>
-      </w:r>
-    </w:p>
-    <w:p>
-      <w:pPr>
-        <w:pBdr>
-          <w:top w:val="single" w:sz="2" w:space="0" w:color="F1F4F5"/>
-          <w:left w:val="single" w:sz="2" w:space="0" w:color="F1F4F5"/>
-          <w:bottom w:val="single" w:sz="2" w:space="0" w:color="F1F4F5"/>
-          <w:right w:val="single" w:sz="2" w:space="0" w:color="F1F4F5"/>
-        </w:pBdr>
-        <w:shd w:val="clear" w:color="auto" w:fill="FFFFFF"/>
-        <w:spacing w:after="0" w:line="240" w:lineRule="auto"/>
-        <w:rPr>
-          <w:rFonts w:ascii="Nunito" w:eastAsia="Times New Roman" w:hAnsi="Nunito" w:cs="Times New Roman"/>
-          <w:color w:val="000000"/>
-          <w:kern w:val="0"/>
-          <w:lang w:eastAsia="tr-TR"/>
-          <w14:ligatures w14:val="none"/>
-        </w:rPr>
-      </w:pPr>
-      <w:r>
-        <w:rPr>
-          <w:rFonts w:ascii="Lucida Sans Unicode" w:eastAsia="Times New Roman" w:hAnsi="Lucida Sans Unicode" w:cs="Lucida Sans Unicode"/>
-          <w:color w:val="000000"/>
-          <w:kern w:val="0"/>
-          <w:bdr w:val="single" w:sz="2" w:space="0" w:color="F1F4F5" w:frame="1"/>
-          <w:lang w:eastAsia="tr-TR"/>
-          <w14:ligatures w14:val="none"/>
-        </w:rPr>
-        <w:t xml:space="preserve">-Nokta, </w:t>
-      </w:r>
-      <w:proofErr w:type="gramStart"/>
-      <w:r>
-        <w:rPr>
-          <w:rFonts w:ascii="Lucida Sans Unicode" w:eastAsia="Times New Roman" w:hAnsi="Lucida Sans Unicode" w:cs="Lucida Sans Unicode"/>
-          <w:color w:val="000000"/>
-          <w:kern w:val="0"/>
-          <w:bdr w:val="single" w:sz="2" w:space="0" w:color="F1F4F5" w:frame="1"/>
-          <w:lang w:eastAsia="tr-TR"/>
-          <w14:ligatures w14:val="none"/>
-        </w:rPr>
-        <w:t>Virgül ,</w:t>
-      </w:r>
-      <w:proofErr w:type="gramEnd"/>
-      <w:r>
-        <w:rPr>
-          <w:rFonts w:ascii="Lucida Sans Unicode" w:eastAsia="Times New Roman" w:hAnsi="Lucida Sans Unicode" w:cs="Lucida Sans Unicode"/>
-          <w:color w:val="000000"/>
-          <w:kern w:val="0"/>
-          <w:bdr w:val="single" w:sz="2" w:space="0" w:color="F1F4F5" w:frame="1"/>
-          <w:lang w:eastAsia="tr-TR"/>
-          <w14:ligatures w14:val="none"/>
-        </w:rPr>
-        <w:t xml:space="preserve"> İki Nokta, Noktalı Virgül ve Üç Nokta</w:t>
-      </w:r>
-    </w:p>
-    <w:p>
-      <w:pPr>
-        <w:pBdr>
-          <w:top w:val="single" w:sz="2" w:space="0" w:color="F1F4F5"/>
-          <w:left w:val="single" w:sz="2" w:space="0" w:color="F1F4F5"/>
-          <w:bottom w:val="single" w:sz="2" w:space="0" w:color="F1F4F5"/>
-          <w:right w:val="single" w:sz="2" w:space="0" w:color="F1F4F5"/>
-        </w:pBdr>
-        <w:shd w:val="clear" w:color="auto" w:fill="FFFFFF"/>
-        <w:spacing w:after="0" w:line="240" w:lineRule="auto"/>
-        <w:rPr>
-          <w:rFonts w:ascii="Nunito" w:eastAsia="Times New Roman" w:hAnsi="Nunito" w:cs="Times New Roman"/>
-          <w:color w:val="000000"/>
-          <w:kern w:val="0"/>
-          <w:lang w:eastAsia="tr-TR"/>
-          <w14:ligatures w14:val="none"/>
-        </w:rPr>
-      </w:pPr>
-      <w:r>
-        <w:rPr>
-          <w:rFonts w:ascii="Lucida Sans Unicode" w:eastAsia="Times New Roman" w:hAnsi="Lucida Sans Unicode" w:cs="Lucida Sans Unicode"/>
-          <w:color w:val="000000"/>
-          <w:kern w:val="0"/>
-          <w:bdr w:val="single" w:sz="2" w:space="0" w:color="F1F4F5" w:frame="1"/>
-          <w:lang w:eastAsia="tr-TR"/>
-          <w14:ligatures w14:val="none"/>
-        </w:rPr>
-        <w:t>-Soru, Ünlem, Tırnak, Kesme, Yay Ayraç, Kısa ve Uzun Çizgi, Eğik Çizgi</w:t>
+        <w:t>Paragrafta Anlam</w:t>
+      </w:r>
+    </w:p>
+    <w:p>
+      <w:pPr>
+        <w:pBdr>
+          <w:top w:val="single" w:sz="2" w:space="0" w:color="F1F4F5"/>
+          <w:left w:val="single" w:sz="2" w:space="0" w:color="F1F4F5"/>
+          <w:bottom w:val="single" w:sz="2" w:space="0" w:color="F1F4F5"/>
+          <w:right w:val="single" w:sz="2" w:space="0" w:color="F1F4F5"/>
+        </w:pBdr>
+        <w:shd w:val="clear" w:color="auto" w:fill="FFFFFF"/>
+        <w:spacing w:after="0" w:line="240" w:lineRule="auto"/>
+        <w:rPr>
+          <w:rFonts w:ascii="Nunito" w:eastAsia="Times New Roman" w:hAnsi="Nunito" w:cs="Times New Roman"/>
+          <w:color w:val="000000"/>
+          <w:kern w:val="0"/>
+          <w:lang w:eastAsia="tr-TR"/>
+          <w14:ligatures w14:val="none"/>
+        </w:rPr>
+      </w:pPr>
+      <w:r>
+        <w:rPr>
+          <w:rFonts w:ascii="Lucida Sans Unicode" w:eastAsia="Times New Roman" w:hAnsi="Lucida Sans Unicode" w:cs="Lucida Sans Unicode"/>
+          <w:color w:val="000000"/>
+          <w:kern w:val="0"/>
+          <w:bdr w:val="single" w:sz="2" w:space="0" w:color="F1F4F5" w:frame="1"/>
+          <w:lang w:eastAsia="tr-TR"/>
+          <w14:ligatures w14:val="none"/>
+        </w:rPr>
+        <w:t>-Metnin Konusu ve Anahtar Kelimeler</w:t>
+      </w:r>
+    </w:p>
+    <w:p>
+      <w:pPr>
+        <w:pBdr>
+          <w:top w:val="single" w:sz="2" w:space="0" w:color="F1F4F5"/>
+          <w:left w:val="single" w:sz="2" w:space="0" w:color="F1F4F5"/>
+          <w:bottom w:val="single" w:sz="2" w:space="0" w:color="F1F4F5"/>
+          <w:right w:val="single" w:sz="2" w:space="0" w:color="F1F4F5"/>
+        </w:pBdr>
+        <w:shd w:val="clear" w:color="auto" w:fill="FFFFFF"/>
+        <w:spacing w:after="0" w:line="240" w:lineRule="auto"/>
+        <w:rPr>
+          <w:rFonts w:ascii="Nunito" w:eastAsia="Times New Roman" w:hAnsi="Nunito" w:cs="Times New Roman"/>
+          <w:color w:val="000000"/>
+          <w:kern w:val="0"/>
+          <w:lang w:eastAsia="tr-TR"/>
+          <w14:ligatures w14:val="none"/>
+        </w:rPr>
+      </w:pPr>
+      <w:r>
+        <w:rPr>
+          <w:rFonts w:ascii="Lucida Sans Unicode" w:eastAsia="Times New Roman" w:hAnsi="Lucida Sans Unicode" w:cs="Lucida Sans Unicode"/>
+          <w:color w:val="000000"/>
+          <w:kern w:val="0"/>
+          <w:bdr w:val="single" w:sz="2" w:space="0" w:color="F1F4F5" w:frame="1"/>
+          <w:lang w:eastAsia="tr-TR"/>
+          <w14:ligatures w14:val="none"/>
+        </w:rPr>
+        <w:t>-Metnin Başlığı</w:t>
+      </w:r>
+    </w:p>
+    <w:p>
+      <w:pPr>
+        <w:pBdr>
+          <w:top w:val="single" w:sz="2" w:space="0" w:color="F1F4F5"/>
+          <w:left w:val="single" w:sz="2" w:space="0" w:color="F1F4F5"/>
+          <w:bottom w:val="single" w:sz="2" w:space="0" w:color="F1F4F5"/>
+          <w:right w:val="single" w:sz="2" w:space="0" w:color="F1F4F5"/>
+        </w:pBdr>
+        <w:shd w:val="clear" w:color="auto" w:fill="FFFFFF"/>
+        <w:spacing w:after="0" w:line="240" w:lineRule="auto"/>
+        <w:rPr>
+          <w:rFonts w:ascii="Nunito" w:eastAsia="Times New Roman" w:hAnsi="Nunito" w:cs="Times New Roman"/>
+          <w:color w:val="000000"/>
+          <w:kern w:val="0"/>
+          <w:lang w:eastAsia="tr-TR"/>
+          <w14:ligatures w14:val="none"/>
+        </w:rPr>
+      </w:pPr>
+      <w:r>
+        <w:rPr>
+          <w:rFonts w:ascii="Lucida Sans Unicode" w:eastAsia="Times New Roman" w:hAnsi="Lucida Sans Unicode" w:cs="Lucida Sans Unicode"/>
+          <w:color w:val="000000"/>
+          <w:kern w:val="0"/>
+          <w:bdr w:val="single" w:sz="2" w:space="0" w:color="F1F4F5" w:frame="1"/>
+          <w:lang w:eastAsia="tr-TR"/>
+          <w14:ligatures w14:val="none"/>
+        </w:rPr>
+        <w:t>-Metnin Ana Düşüncesi</w:t>
+      </w:r>
+    </w:p>
+    <w:p>
+      <w:pPr>
+        <w:pBdr>
+          <w:top w:val="single" w:sz="2" w:space="0" w:color="F1F4F5"/>
+          <w:left w:val="single" w:sz="2" w:space="0" w:color="F1F4F5"/>
+          <w:bottom w:val="single" w:sz="2" w:space="0" w:color="F1F4F5"/>
+          <w:right w:val="single" w:sz="2" w:space="0" w:color="F1F4F5"/>
+        </w:pBdr>
+        <w:shd w:val="clear" w:color="auto" w:fill="FFFFFF"/>
+        <w:spacing w:after="0" w:line="240" w:lineRule="auto"/>
+        <w:rPr>
+          <w:rFonts w:ascii="Nunito" w:eastAsia="Times New Roman" w:hAnsi="Nunito" w:cs="Times New Roman"/>
+          <w:color w:val="000000"/>
+          <w:kern w:val="0"/>
+          <w:lang w:eastAsia="tr-TR"/>
+          <w14:ligatures w14:val="none"/>
+        </w:rPr>
+      </w:pPr>
+      <w:r>
+        <w:rPr>
+          <w:rFonts w:ascii="Lucida Sans Unicode" w:eastAsia="Times New Roman" w:hAnsi="Lucida Sans Unicode" w:cs="Lucida Sans Unicode"/>
+          <w:color w:val="000000"/>
+          <w:kern w:val="0"/>
+          <w:bdr w:val="single" w:sz="2" w:space="0" w:color="F1F4F5" w:frame="1"/>
+          <w:lang w:eastAsia="tr-TR"/>
+          <w14:ligatures w14:val="none"/>
+        </w:rPr>
+        <w:lastRenderedPageBreak/>
+        <w:t>-Metnin Yardımcı Düşünceleri</w:t>
+      </w:r>
+    </w:p>
+    <w:p>
+      <w:pPr>
+        <w:pBdr>
+          <w:top w:val="single" w:sz="2" w:space="0" w:color="F1F4F5"/>
+          <w:left w:val="single" w:sz="2" w:space="0" w:color="F1F4F5"/>
+          <w:bottom w:val="single" w:sz="2" w:space="0" w:color="F1F4F5"/>
+          <w:right w:val="single" w:sz="2" w:space="0" w:color="F1F4F5"/>
+        </w:pBdr>
+        <w:shd w:val="clear" w:color="auto" w:fill="FFFFFF"/>
+        <w:spacing w:after="0" w:line="240" w:lineRule="auto"/>
+        <w:rPr>
+          <w:rFonts w:ascii="Nunito" w:eastAsia="Times New Roman" w:hAnsi="Nunito" w:cs="Times New Roman"/>
+          <w:color w:val="000000"/>
+          <w:kern w:val="0"/>
+          <w:lang w:eastAsia="tr-TR"/>
+          <w14:ligatures w14:val="none"/>
+        </w:rPr>
+      </w:pPr>
+      <w:r>
+        <w:rPr>
+          <w:rFonts w:ascii="Lucida Sans Unicode" w:eastAsia="Times New Roman" w:hAnsi="Lucida Sans Unicode" w:cs="Lucida Sans Unicode"/>
+          <w:color w:val="000000"/>
+          <w:kern w:val="0"/>
+          <w:bdr w:val="single" w:sz="2" w:space="0" w:color="F1F4F5" w:frame="1"/>
+          <w:lang w:eastAsia="tr-TR"/>
+          <w14:ligatures w14:val="none"/>
+        </w:rPr>
+        <w:t>-Hikâye Unsurları, Anlatıcı Türleri, Gerçek ve Kurgusal Unsurlar</w:t>
+      </w:r>
+    </w:p>
+    <w:p>
+      <w:pPr>
+        <w:pBdr>
+          <w:top w:val="single" w:sz="2" w:space="0" w:color="F1F4F5"/>
+          <w:left w:val="single" w:sz="2" w:space="0" w:color="F1F4F5"/>
+          <w:bottom w:val="single" w:sz="2" w:space="0" w:color="F1F4F5"/>
+          <w:right w:val="single" w:sz="2" w:space="0" w:color="F1F4F5"/>
+        </w:pBdr>
+        <w:shd w:val="clear" w:color="auto" w:fill="FFFFFF"/>
+        <w:spacing w:after="0" w:line="240" w:lineRule="auto"/>
+        <w:rPr>
+          <w:rFonts w:ascii="Nunito" w:eastAsia="Times New Roman" w:hAnsi="Nunito" w:cs="Times New Roman"/>
+          <w:color w:val="000000"/>
+          <w:kern w:val="0"/>
+          <w:lang w:eastAsia="tr-TR"/>
+          <w14:ligatures w14:val="none"/>
+        </w:rPr>
+      </w:pPr>
+      <w:r>
+        <w:rPr>
+          <w:rFonts w:ascii="Lucida Sans Unicode" w:eastAsia="Times New Roman" w:hAnsi="Lucida Sans Unicode" w:cs="Lucida Sans Unicode"/>
+          <w:color w:val="000000"/>
+          <w:kern w:val="0"/>
+          <w:bdr w:val="single" w:sz="2" w:space="0" w:color="F1F4F5" w:frame="1"/>
+          <w:lang w:eastAsia="tr-TR"/>
+          <w14:ligatures w14:val="none"/>
+        </w:rPr>
+        <w:t>-Metinde Soru</w:t>
+      </w:r>
+    </w:p>
+    <w:p>
+      <w:pPr>
+        <w:pBdr>
+          <w:top w:val="single" w:sz="2" w:space="0" w:color="F1F4F5"/>
+          <w:left w:val="single" w:sz="2" w:space="0" w:color="F1F4F5"/>
+          <w:bottom w:val="single" w:sz="2" w:space="0" w:color="F1F4F5"/>
+          <w:right w:val="single" w:sz="2" w:space="0" w:color="F1F4F5"/>
+        </w:pBdr>
+        <w:shd w:val="clear" w:color="auto" w:fill="FFFFFF"/>
+        <w:spacing w:after="0" w:line="240" w:lineRule="auto"/>
+        <w:rPr>
+          <w:rFonts w:ascii="Nunito" w:eastAsia="Times New Roman" w:hAnsi="Nunito" w:cs="Times New Roman"/>
+          <w:color w:val="000000"/>
+          <w:kern w:val="0"/>
+          <w:lang w:eastAsia="tr-TR"/>
+          <w14:ligatures w14:val="none"/>
+        </w:rPr>
+      </w:pPr>
+      <w:r>
+        <w:rPr>
+          <w:rFonts w:ascii="Lucida Sans Unicode" w:eastAsia="Times New Roman" w:hAnsi="Lucida Sans Unicode" w:cs="Lucida Sans Unicode"/>
+          <w:color w:val="000000"/>
+          <w:kern w:val="0"/>
+          <w:bdr w:val="single" w:sz="2" w:space="0" w:color="F1F4F5" w:frame="1"/>
+          <w:lang w:eastAsia="tr-TR"/>
+          <w14:ligatures w14:val="none"/>
+        </w:rPr>
+        <w:t>-Metnin Bölümleri, Metin Oluşturma ve Metin Tamamlama</w:t>
+      </w:r>
+    </w:p>
+    <w:p>
+      <w:pPr>
+        <w:pBdr>
+          <w:top w:val="single" w:sz="2" w:space="0" w:color="F1F4F5"/>
+          <w:left w:val="single" w:sz="2" w:space="0" w:color="F1F4F5"/>
+          <w:bottom w:val="single" w:sz="2" w:space="0" w:color="F1F4F5"/>
+          <w:right w:val="single" w:sz="2" w:space="0" w:color="F1F4F5"/>
+        </w:pBdr>
+        <w:shd w:val="clear" w:color="auto" w:fill="FFFFFF"/>
+        <w:spacing w:after="0" w:line="240" w:lineRule="auto"/>
+        <w:rPr>
+          <w:rFonts w:ascii="Nunito" w:eastAsia="Times New Roman" w:hAnsi="Nunito" w:cs="Times New Roman"/>
+          <w:color w:val="000000"/>
+          <w:kern w:val="0"/>
+          <w:lang w:eastAsia="tr-TR"/>
+          <w14:ligatures w14:val="none"/>
+        </w:rPr>
+      </w:pPr>
+      <w:r>
+        <w:rPr>
+          <w:rFonts w:ascii="Lucida Sans Unicode" w:eastAsia="Times New Roman" w:hAnsi="Lucida Sans Unicode" w:cs="Lucida Sans Unicode"/>
+          <w:color w:val="000000"/>
+          <w:kern w:val="0"/>
+          <w:bdr w:val="single" w:sz="2" w:space="0" w:color="F1F4F5" w:frame="1"/>
+          <w:lang w:eastAsia="tr-TR"/>
+          <w14:ligatures w14:val="none"/>
+        </w:rPr>
+        <w:t>-Yönlendirici İfadeler</w:t>
+      </w:r>
+    </w:p>
+    <w:p>
+      <w:pPr>
+        <w:pBdr>
+          <w:top w:val="single" w:sz="2" w:space="0" w:color="F1F4F5"/>
+          <w:left w:val="single" w:sz="2" w:space="0" w:color="F1F4F5"/>
+          <w:bottom w:val="single" w:sz="2" w:space="0" w:color="F1F4F5"/>
+          <w:right w:val="single" w:sz="2" w:space="0" w:color="F1F4F5"/>
+        </w:pBdr>
+        <w:shd w:val="clear" w:color="auto" w:fill="FFFFFF"/>
+        <w:spacing w:after="0" w:line="240" w:lineRule="auto"/>
+        <w:rPr>
+          <w:rFonts w:ascii="Nunito" w:eastAsia="Times New Roman" w:hAnsi="Nunito" w:cs="Times New Roman"/>
+          <w:color w:val="000000"/>
+          <w:kern w:val="0"/>
+          <w:lang w:eastAsia="tr-TR"/>
+          <w14:ligatures w14:val="none"/>
+        </w:rPr>
+      </w:pPr>
+      <w:r>
+        <w:rPr>
+          <w:rFonts w:ascii="Lucida Sans Unicode" w:eastAsia="Times New Roman" w:hAnsi="Lucida Sans Unicode" w:cs="Lucida Sans Unicode"/>
+          <w:color w:val="000000"/>
+          <w:kern w:val="0"/>
+          <w:bdr w:val="single" w:sz="2" w:space="0" w:color="F1F4F5" w:frame="1"/>
+          <w:lang w:eastAsia="tr-TR"/>
+          <w14:ligatures w14:val="none"/>
+        </w:rPr>
+        <w:t>-Anlatıcı Biçimleri ve Düşünceyi Geliştirme Yolları</w:t>
+      </w:r>
+    </w:p>
+    <w:p>
+      <w:pPr>
+        <w:pBdr>
+          <w:top w:val="single" w:sz="2" w:space="0" w:color="F1F4F5"/>
+          <w:left w:val="single" w:sz="2" w:space="0" w:color="F1F4F5"/>
+          <w:bottom w:val="single" w:sz="2" w:space="0" w:color="F1F4F5"/>
+          <w:right w:val="single" w:sz="2" w:space="0" w:color="F1F4F5"/>
+        </w:pBdr>
+        <w:shd w:val="clear" w:color="auto" w:fill="FFFFFF"/>
+        <w:spacing w:after="0" w:line="240" w:lineRule="auto"/>
+        <w:rPr>
+          <w:rFonts w:ascii="Nunito" w:eastAsia="Times New Roman" w:hAnsi="Nunito" w:cs="Times New Roman"/>
+          <w:color w:val="000000"/>
+          <w:kern w:val="0"/>
+          <w:lang w:eastAsia="tr-TR"/>
+          <w14:ligatures w14:val="none"/>
+        </w:rPr>
+      </w:pPr>
+      <w:r>
+        <w:rPr>
+          <w:rFonts w:ascii="Lucida Sans Unicode" w:eastAsia="Times New Roman" w:hAnsi="Lucida Sans Unicode" w:cs="Lucida Sans Unicode"/>
+          <w:color w:val="000000"/>
+          <w:kern w:val="0"/>
+          <w:bdr w:val="single" w:sz="2" w:space="0" w:color="F1F4F5" w:frame="1"/>
+          <w:lang w:eastAsia="tr-TR"/>
+          <w14:ligatures w14:val="none"/>
+        </w:rPr>
+        <w:t>-Metnin Dil Anlatım ve Özellikleri</w:t>
+      </w:r>
+    </w:p>
+    <w:p>
+      <w:pPr>
+        <w:pBdr>
+          <w:top w:val="single" w:sz="2" w:space="0" w:color="F1F4F5"/>
+          <w:left w:val="single" w:sz="2" w:space="0" w:color="F1F4F5"/>
+          <w:bottom w:val="single" w:sz="2" w:space="0" w:color="F1F4F5"/>
+          <w:right w:val="single" w:sz="2" w:space="0" w:color="F1F4F5"/>
+        </w:pBdr>
+        <w:shd w:val="clear" w:color="auto" w:fill="FFFFFF"/>
+        <w:spacing w:after="0" w:line="240" w:lineRule="auto"/>
+        <w:rPr>
+          <w:rFonts w:ascii="Nunito" w:eastAsia="Times New Roman" w:hAnsi="Nunito" w:cs="Times New Roman"/>
+          <w:color w:val="000000"/>
+          <w:kern w:val="0"/>
+          <w:lang w:eastAsia="tr-TR"/>
+          <w14:ligatures w14:val="none"/>
+        </w:rPr>
+      </w:pPr>
+      <w:r>
+        <w:rPr>
+          <w:rFonts w:ascii="Lucida Sans Unicode" w:eastAsia="Times New Roman" w:hAnsi="Lucida Sans Unicode" w:cs="Lucida Sans Unicode"/>
+          <w:color w:val="000000"/>
+          <w:kern w:val="0"/>
+          <w:bdr w:val="single" w:sz="2" w:space="0" w:color="F1F4F5" w:frame="1"/>
+          <w:lang w:eastAsia="tr-TR"/>
+          <w14:ligatures w14:val="none"/>
+        </w:rPr>
+        <w:t>-Metin Karşılaştırma</w:t>
+      </w:r>
+    </w:p>
+    <w:p>
+      <w:pPr>
+        <w:pBdr>
+          <w:top w:val="single" w:sz="2" w:space="0" w:color="F1F4F5"/>
+          <w:left w:val="single" w:sz="2" w:space="0" w:color="F1F4F5"/>
+          <w:bottom w:val="single" w:sz="2" w:space="0" w:color="F1F4F5"/>
+          <w:right w:val="single" w:sz="2" w:space="0" w:color="F1F4F5"/>
+        </w:pBdr>
+        <w:shd w:val="clear" w:color="auto" w:fill="FFFFFF"/>
+        <w:spacing w:after="0" w:line="240" w:lineRule="auto"/>
+        <w:rPr>
+          <w:rFonts w:ascii="Nunito" w:eastAsia="Times New Roman" w:hAnsi="Nunito" w:cs="Times New Roman"/>
+          <w:color w:val="000000"/>
+          <w:kern w:val="0"/>
+          <w:lang w:eastAsia="tr-TR"/>
+          <w14:ligatures w14:val="none"/>
+        </w:rPr>
+      </w:pPr>
+      <w:r>
+        <w:rPr>
+          <w:rFonts w:ascii="Lucida Sans Unicode" w:eastAsia="Times New Roman" w:hAnsi="Lucida Sans Unicode" w:cs="Lucida Sans Unicode"/>
+          <w:color w:val="000000"/>
+          <w:kern w:val="0"/>
+          <w:bdr w:val="single" w:sz="2" w:space="0" w:color="F1F4F5" w:frame="1"/>
+          <w:lang w:eastAsia="tr-TR"/>
+          <w14:ligatures w14:val="none"/>
+        </w:rPr>
+        <w:t>-Görsel Yorumlama ve Grafik Okuma</w:t>
       </w:r>
     </w:p>
     <w:p>
@@ -3180,6 +2632,719 @@
           <w14:ligatures w14:val="none"/>
         </w:rPr>
       </w:pPr>
+      <w:r>
+        <w:rPr>
+          <w:rFonts w:ascii="inherit" w:eastAsia="Times New Roman" w:hAnsi="inherit" w:cs="Lucida Sans Unicode"/>
+          <w:b/>
+          <w:bCs/>
+          <w:color w:val="000000"/>
+          <w:kern w:val="0"/>
+          <w:sz w:val="27"/>
+          <w:szCs w:val="27"/>
+          <w:bdr w:val="single" w:sz="2" w:space="0" w:color="F1F4F5" w:frame="1"/>
+          <w:lang w:eastAsia="tr-TR"/>
+          <w14:ligatures w14:val="none"/>
+        </w:rPr>
+        <w:t>6</w:t>
+      </w:r>
+      <w:r>
+        <w:rPr>
+          <w:rFonts w:ascii="inherit" w:eastAsia="Times New Roman" w:hAnsi="inherit" w:cs="Lucida Sans Unicode"/>
+          <w:b/>
+          <w:bCs/>
+          <w:color w:val="000000"/>
+          <w:kern w:val="0"/>
+          <w:sz w:val="27"/>
+          <w:szCs w:val="27"/>
+          <w:bdr w:val="single" w:sz="2" w:space="0" w:color="F1F4F5" w:frame="1"/>
+          <w:lang w:eastAsia="tr-TR"/>
+          <w14:ligatures w14:val="none"/>
+        </w:rPr>
+        <w:t>Fiiller</w:t>
+      </w:r>
+    </w:p>
+    <w:p>
+      <w:pPr>
+        <w:pBdr>
+          <w:top w:val="single" w:sz="2" w:space="0" w:color="F1F4F5"/>
+          <w:left w:val="single" w:sz="2" w:space="0" w:color="F1F4F5"/>
+          <w:bottom w:val="single" w:sz="2" w:space="0" w:color="F1F4F5"/>
+          <w:right w:val="single" w:sz="2" w:space="0" w:color="F1F4F5"/>
+        </w:pBdr>
+        <w:shd w:val="clear" w:color="auto" w:fill="FFFFFF"/>
+        <w:spacing w:after="0" w:line="240" w:lineRule="auto"/>
+        <w:rPr>
+          <w:rFonts w:ascii="Nunito" w:eastAsia="Times New Roman" w:hAnsi="Nunito" w:cs="Times New Roman"/>
+          <w:color w:val="000000"/>
+          <w:kern w:val="0"/>
+          <w:lang w:eastAsia="tr-TR"/>
+          <w14:ligatures w14:val="none"/>
+        </w:rPr>
+      </w:pPr>
+      <w:r>
+        <w:rPr>
+          <w:rFonts w:ascii="Lucida Sans Unicode" w:eastAsia="Times New Roman" w:hAnsi="Lucida Sans Unicode" w:cs="Lucida Sans Unicode"/>
+          <w:color w:val="000000"/>
+          <w:kern w:val="0"/>
+          <w:bdr w:val="single" w:sz="2" w:space="0" w:color="F1F4F5" w:frame="1"/>
+          <w:lang w:eastAsia="tr-TR"/>
+          <w14:ligatures w14:val="none"/>
+        </w:rPr>
+        <w:t>-Fiillerin Anlam Özellikleri</w:t>
+      </w:r>
+    </w:p>
+    <w:p>
+      <w:pPr>
+        <w:pBdr>
+          <w:top w:val="single" w:sz="2" w:space="0" w:color="F1F4F5"/>
+          <w:left w:val="single" w:sz="2" w:space="0" w:color="F1F4F5"/>
+          <w:bottom w:val="single" w:sz="2" w:space="0" w:color="F1F4F5"/>
+          <w:right w:val="single" w:sz="2" w:space="0" w:color="F1F4F5"/>
+        </w:pBdr>
+        <w:shd w:val="clear" w:color="auto" w:fill="FFFFFF"/>
+        <w:spacing w:after="0" w:line="240" w:lineRule="auto"/>
+        <w:rPr>
+          <w:rFonts w:ascii="Nunito" w:eastAsia="Times New Roman" w:hAnsi="Nunito" w:cs="Times New Roman"/>
+          <w:color w:val="000000"/>
+          <w:kern w:val="0"/>
+          <w:lang w:eastAsia="tr-TR"/>
+          <w14:ligatures w14:val="none"/>
+        </w:rPr>
+      </w:pPr>
+      <w:r>
+        <w:rPr>
+          <w:rFonts w:ascii="Lucida Sans Unicode" w:eastAsia="Times New Roman" w:hAnsi="Lucida Sans Unicode" w:cs="Lucida Sans Unicode"/>
+          <w:color w:val="000000"/>
+          <w:kern w:val="0"/>
+          <w:bdr w:val="single" w:sz="2" w:space="0" w:color="F1F4F5" w:frame="1"/>
+          <w:lang w:eastAsia="tr-TR"/>
+          <w14:ligatures w14:val="none"/>
+        </w:rPr>
+        <w:t>-Haber Kipleri, Dilek Kipleri ve Kişi Ekleri</w:t>
+      </w:r>
+    </w:p>
+    <w:p>
+      <w:pPr>
+        <w:pBdr>
+          <w:top w:val="single" w:sz="2" w:space="0" w:color="F1F4F5"/>
+          <w:left w:val="single" w:sz="2" w:space="0" w:color="F1F4F5"/>
+          <w:bottom w:val="single" w:sz="2" w:space="0" w:color="F1F4F5"/>
+          <w:right w:val="single" w:sz="2" w:space="0" w:color="F1F4F5"/>
+        </w:pBdr>
+        <w:shd w:val="clear" w:color="auto" w:fill="FFFFFF"/>
+        <w:spacing w:after="0" w:line="240" w:lineRule="auto"/>
+        <w:rPr>
+          <w:rFonts w:ascii="Nunito" w:eastAsia="Times New Roman" w:hAnsi="Nunito" w:cs="Times New Roman"/>
+          <w:color w:val="000000"/>
+          <w:kern w:val="0"/>
+          <w:lang w:eastAsia="tr-TR"/>
+          <w14:ligatures w14:val="none"/>
+        </w:rPr>
+      </w:pPr>
+      <w:r>
+        <w:rPr>
+          <w:rFonts w:ascii="Lucida Sans Unicode" w:eastAsia="Times New Roman" w:hAnsi="Lucida Sans Unicode" w:cs="Lucida Sans Unicode"/>
+          <w:color w:val="000000"/>
+          <w:kern w:val="0"/>
+          <w:bdr w:val="single" w:sz="2" w:space="0" w:color="F1F4F5" w:frame="1"/>
+          <w:lang w:eastAsia="tr-TR"/>
+          <w14:ligatures w14:val="none"/>
+        </w:rPr>
+        <w:t>-Fiillerde Olumsuz, Soru Çekimi ve Anlam Kayması</w:t>
+      </w:r>
+    </w:p>
+    <w:p>
+      <w:pPr>
+        <w:pBdr>
+          <w:top w:val="single" w:sz="2" w:space="0" w:color="F1F4F5"/>
+          <w:left w:val="single" w:sz="2" w:space="0" w:color="F1F4F5"/>
+          <w:bottom w:val="single" w:sz="2" w:space="0" w:color="F1F4F5"/>
+          <w:right w:val="single" w:sz="2" w:space="0" w:color="F1F4F5"/>
+        </w:pBdr>
+        <w:shd w:val="clear" w:color="auto" w:fill="FFFFFF"/>
+        <w:spacing w:after="0" w:line="240" w:lineRule="auto"/>
+        <w:rPr>
+          <w:rFonts w:ascii="Nunito" w:eastAsia="Times New Roman" w:hAnsi="Nunito" w:cs="Times New Roman"/>
+          <w:color w:val="000000"/>
+          <w:kern w:val="0"/>
+          <w:lang w:eastAsia="tr-TR"/>
+          <w14:ligatures w14:val="none"/>
+        </w:rPr>
+      </w:pPr>
+      <w:r>
+        <w:rPr>
+          <w:rFonts w:ascii="Lucida Sans Unicode" w:eastAsia="Times New Roman" w:hAnsi="Lucida Sans Unicode" w:cs="Lucida Sans Unicode"/>
+          <w:color w:val="000000"/>
+          <w:kern w:val="0"/>
+          <w:bdr w:val="single" w:sz="2" w:space="0" w:color="F1F4F5" w:frame="1"/>
+          <w:lang w:eastAsia="tr-TR"/>
+          <w14:ligatures w14:val="none"/>
+        </w:rPr>
+        <w:t>-Fiillerde Yapı</w:t>
+      </w:r>
+    </w:p>
+    <w:p>
+      <w:pPr>
+        <w:pBdr>
+          <w:top w:val="single" w:sz="2" w:space="0" w:color="F1F4F5"/>
+          <w:left w:val="single" w:sz="2" w:space="0" w:color="F1F4F5"/>
+          <w:bottom w:val="single" w:sz="2" w:space="0" w:color="F1F4F5"/>
+          <w:right w:val="single" w:sz="2" w:space="0" w:color="F1F4F5"/>
+        </w:pBdr>
+        <w:shd w:val="clear" w:color="auto" w:fill="FFFFFF"/>
+        <w:spacing w:after="0" w:line="240" w:lineRule="auto"/>
+        <w:rPr>
+          <w:rFonts w:ascii="Nunito" w:eastAsia="Times New Roman" w:hAnsi="Nunito" w:cs="Times New Roman"/>
+          <w:color w:val="000000"/>
+          <w:kern w:val="0"/>
+          <w:lang w:eastAsia="tr-TR"/>
+          <w14:ligatures w14:val="none"/>
+        </w:rPr>
+      </w:pPr>
+      <w:r>
+        <w:rPr>
+          <w:rFonts w:ascii="Lucida Sans Unicode" w:eastAsia="Times New Roman" w:hAnsi="Lucida Sans Unicode" w:cs="Lucida Sans Unicode"/>
+          <w:color w:val="000000"/>
+          <w:kern w:val="0"/>
+          <w:bdr w:val="single" w:sz="2" w:space="0" w:color="F1F4F5" w:frame="1"/>
+          <w:lang w:eastAsia="tr-TR"/>
+          <w14:ligatures w14:val="none"/>
+        </w:rPr>
+        <w:t>-Ek Fiil</w:t>
+      </w:r>
+    </w:p>
+    <w:p>
+      <w:pPr>
+        <w:pBdr>
+          <w:top w:val="single" w:sz="2" w:space="0" w:color="F1F4F5"/>
+          <w:left w:val="single" w:sz="2" w:space="0" w:color="F1F4F5"/>
+          <w:bottom w:val="single" w:sz="2" w:space="0" w:color="F1F4F5"/>
+          <w:right w:val="single" w:sz="2" w:space="0" w:color="F1F4F5"/>
+        </w:pBdr>
+        <w:shd w:val="clear" w:color="auto" w:fill="FFFFFF"/>
+        <w:spacing w:after="0" w:line="240" w:lineRule="auto"/>
+        <w:outlineLvl w:val="2"/>
+        <w:rPr>
+          <w:rFonts w:ascii="Nunito" w:eastAsia="Times New Roman" w:hAnsi="Nunito" w:cs="Times New Roman"/>
+          <w:b/>
+          <w:bCs/>
+          <w:color w:val="000000"/>
+          <w:kern w:val="0"/>
+          <w:lang w:eastAsia="tr-TR"/>
+          <w14:ligatures w14:val="none"/>
+        </w:rPr>
+      </w:pPr>
+      <w:r>
+        <w:rPr>
+          <w:rFonts w:ascii="inherit" w:eastAsia="Times New Roman" w:hAnsi="inherit" w:cs="Lucida Sans Unicode"/>
+          <w:b/>
+          <w:bCs/>
+          <w:color w:val="000000"/>
+          <w:kern w:val="0"/>
+          <w:sz w:val="27"/>
+          <w:szCs w:val="27"/>
+          <w:bdr w:val="single" w:sz="2" w:space="0" w:color="F1F4F5" w:frame="1"/>
+          <w:lang w:eastAsia="tr-TR"/>
+          <w14:ligatures w14:val="none"/>
+        </w:rPr>
+        <w:t>7</w:t>
+      </w:r>
+      <w:r>
+        <w:rPr>
+          <w:rFonts w:ascii="inherit" w:eastAsia="Times New Roman" w:hAnsi="inherit" w:cs="Lucida Sans Unicode"/>
+          <w:b/>
+          <w:bCs/>
+          <w:color w:val="000000"/>
+          <w:kern w:val="0"/>
+          <w:sz w:val="27"/>
+          <w:szCs w:val="27"/>
+          <w:bdr w:val="single" w:sz="2" w:space="0" w:color="F1F4F5" w:frame="1"/>
+          <w:lang w:eastAsia="tr-TR"/>
+          <w14:ligatures w14:val="none"/>
+        </w:rPr>
+        <w:t>Zarflar</w:t>
+      </w:r>
+    </w:p>
+    <w:p>
+      <w:pPr>
+        <w:pBdr>
+          <w:top w:val="single" w:sz="2" w:space="0" w:color="F1F4F5"/>
+          <w:left w:val="single" w:sz="2" w:space="0" w:color="F1F4F5"/>
+          <w:bottom w:val="single" w:sz="2" w:space="0" w:color="F1F4F5"/>
+          <w:right w:val="single" w:sz="2" w:space="0" w:color="F1F4F5"/>
+        </w:pBdr>
+        <w:shd w:val="clear" w:color="auto" w:fill="FFFFFF"/>
+        <w:spacing w:after="0" w:line="240" w:lineRule="auto"/>
+        <w:rPr>
+          <w:rFonts w:ascii="Nunito" w:eastAsia="Times New Roman" w:hAnsi="Nunito" w:cs="Times New Roman"/>
+          <w:color w:val="000000"/>
+          <w:kern w:val="0"/>
+          <w:lang w:eastAsia="tr-TR"/>
+          <w14:ligatures w14:val="none"/>
+        </w:rPr>
+      </w:pPr>
+      <w:r>
+        <w:rPr>
+          <w:rFonts w:ascii="Lucida Sans Unicode" w:eastAsia="Times New Roman" w:hAnsi="Lucida Sans Unicode" w:cs="Lucida Sans Unicode"/>
+          <w:color w:val="000000"/>
+          <w:kern w:val="0"/>
+          <w:bdr w:val="single" w:sz="2" w:space="0" w:color="F1F4F5" w:frame="1"/>
+          <w:lang w:eastAsia="tr-TR"/>
+          <w14:ligatures w14:val="none"/>
+        </w:rPr>
+        <w:t>-Durum, Zaman, Yer Yön, Miktar ve Soru Zarfları</w:t>
+      </w:r>
+    </w:p>
+    <w:p>
+      <w:pPr>
+        <w:pBdr>
+          <w:top w:val="single" w:sz="2" w:space="0" w:color="F1F4F5"/>
+          <w:left w:val="single" w:sz="2" w:space="0" w:color="F1F4F5"/>
+          <w:bottom w:val="single" w:sz="2" w:space="0" w:color="F1F4F5"/>
+          <w:right w:val="single" w:sz="2" w:space="0" w:color="F1F4F5"/>
+        </w:pBdr>
+        <w:shd w:val="clear" w:color="auto" w:fill="FFFFFF"/>
+        <w:spacing w:after="0" w:line="240" w:lineRule="auto"/>
+        <w:outlineLvl w:val="2"/>
+        <w:rPr>
+          <w:rFonts w:ascii="Nunito" w:eastAsia="Times New Roman" w:hAnsi="Nunito" w:cs="Times New Roman"/>
+          <w:b/>
+          <w:bCs/>
+          <w:color w:val="000000"/>
+          <w:kern w:val="0"/>
+          <w:lang w:eastAsia="tr-TR"/>
+          <w14:ligatures w14:val="none"/>
+        </w:rPr>
+      </w:pPr>
+      <w:r>
+        <w:rPr>
+          <w:rFonts w:ascii="inherit" w:eastAsia="Times New Roman" w:hAnsi="inherit" w:cs="Lucida Sans Unicode"/>
+          <w:b/>
+          <w:bCs/>
+          <w:color w:val="000000"/>
+          <w:kern w:val="0"/>
+          <w:sz w:val="27"/>
+          <w:szCs w:val="27"/>
+          <w:bdr w:val="single" w:sz="2" w:space="0" w:color="F1F4F5" w:frame="1"/>
+          <w:lang w:eastAsia="tr-TR"/>
+          <w14:ligatures w14:val="none"/>
+        </w:rPr>
+        <w:t>8</w:t>
+      </w:r>
+      <w:r>
+        <w:rPr>
+          <w:rFonts w:ascii="inherit" w:eastAsia="Times New Roman" w:hAnsi="inherit" w:cs="Lucida Sans Unicode"/>
+          <w:b/>
+          <w:bCs/>
+          <w:color w:val="000000"/>
+          <w:kern w:val="0"/>
+          <w:sz w:val="27"/>
+          <w:szCs w:val="27"/>
+          <w:bdr w:val="single" w:sz="2" w:space="0" w:color="F1F4F5" w:frame="1"/>
+          <w:lang w:eastAsia="tr-TR"/>
+          <w14:ligatures w14:val="none"/>
+        </w:rPr>
+        <w:t>Anlatım Bozuklukları</w:t>
+      </w:r>
+    </w:p>
+    <w:p>
+      <w:pPr>
+        <w:pBdr>
+          <w:top w:val="single" w:sz="2" w:space="0" w:color="F1F4F5"/>
+          <w:left w:val="single" w:sz="2" w:space="0" w:color="F1F4F5"/>
+          <w:bottom w:val="single" w:sz="2" w:space="0" w:color="F1F4F5"/>
+          <w:right w:val="single" w:sz="2" w:space="0" w:color="F1F4F5"/>
+        </w:pBdr>
+        <w:shd w:val="clear" w:color="auto" w:fill="FFFFFF"/>
+        <w:spacing w:after="0" w:line="240" w:lineRule="auto"/>
+        <w:rPr>
+          <w:rFonts w:ascii="Nunito" w:eastAsia="Times New Roman" w:hAnsi="Nunito" w:cs="Times New Roman"/>
+          <w:color w:val="000000"/>
+          <w:kern w:val="0"/>
+          <w:lang w:eastAsia="tr-TR"/>
+          <w14:ligatures w14:val="none"/>
+        </w:rPr>
+      </w:pPr>
+      <w:r>
+        <w:rPr>
+          <w:rFonts w:ascii="Lucida Sans Unicode" w:eastAsia="Times New Roman" w:hAnsi="Lucida Sans Unicode" w:cs="Lucida Sans Unicode"/>
+          <w:color w:val="000000"/>
+          <w:kern w:val="0"/>
+          <w:bdr w:val="single" w:sz="2" w:space="0" w:color="F1F4F5" w:frame="1"/>
+          <w:lang w:eastAsia="tr-TR"/>
+          <w14:ligatures w14:val="none"/>
+        </w:rPr>
+        <w:t>-Anlatım Bozuklukları</w:t>
+      </w:r>
+    </w:p>
+    <w:p>
+      <w:pPr>
+        <w:pBdr>
+          <w:top w:val="single" w:sz="2" w:space="0" w:color="F1F4F5"/>
+          <w:left w:val="single" w:sz="2" w:space="0" w:color="F1F4F5"/>
+          <w:bottom w:val="single" w:sz="2" w:space="0" w:color="F1F4F5"/>
+          <w:right w:val="single" w:sz="2" w:space="0" w:color="F1F4F5"/>
+        </w:pBdr>
+        <w:shd w:val="clear" w:color="auto" w:fill="FFFFFF"/>
+        <w:spacing w:after="0" w:line="240" w:lineRule="auto"/>
+        <w:outlineLvl w:val="2"/>
+        <w:rPr>
+          <w:rFonts w:ascii="Nunito" w:eastAsia="Times New Roman" w:hAnsi="Nunito" w:cs="Times New Roman"/>
+          <w:b/>
+          <w:bCs/>
+          <w:color w:val="000000"/>
+          <w:kern w:val="0"/>
+          <w:lang w:eastAsia="tr-TR"/>
+          <w14:ligatures w14:val="none"/>
+        </w:rPr>
+      </w:pPr>
+      <w:r>
+        <w:rPr>
+          <w:rFonts w:ascii="inherit" w:eastAsia="Times New Roman" w:hAnsi="inherit" w:cs="Lucida Sans Unicode"/>
+          <w:b/>
+          <w:bCs/>
+          <w:color w:val="000000"/>
+          <w:kern w:val="0"/>
+          <w:sz w:val="27"/>
+          <w:szCs w:val="27"/>
+          <w:bdr w:val="single" w:sz="2" w:space="0" w:color="F1F4F5" w:frame="1"/>
+          <w:lang w:eastAsia="tr-TR"/>
+          <w14:ligatures w14:val="none"/>
+        </w:rPr>
+        <w:t>9</w:t>
+      </w:r>
+      <w:r>
+        <w:rPr>
+          <w:rFonts w:ascii="inherit" w:eastAsia="Times New Roman" w:hAnsi="inherit" w:cs="Lucida Sans Unicode"/>
+          <w:b/>
+          <w:bCs/>
+          <w:color w:val="000000"/>
+          <w:kern w:val="0"/>
+          <w:sz w:val="27"/>
+          <w:szCs w:val="27"/>
+          <w:bdr w:val="single" w:sz="2" w:space="0" w:color="F1F4F5" w:frame="1"/>
+          <w:lang w:eastAsia="tr-TR"/>
+          <w14:ligatures w14:val="none"/>
+        </w:rPr>
+        <w:t>Yazım Kuralları</w:t>
+      </w:r>
+    </w:p>
+    <w:p>
+      <w:pPr>
+        <w:pBdr>
+          <w:top w:val="single" w:sz="2" w:space="0" w:color="F1F4F5"/>
+          <w:left w:val="single" w:sz="2" w:space="0" w:color="F1F4F5"/>
+          <w:bottom w:val="single" w:sz="2" w:space="0" w:color="F1F4F5"/>
+          <w:right w:val="single" w:sz="2" w:space="0" w:color="F1F4F5"/>
+        </w:pBdr>
+        <w:shd w:val="clear" w:color="auto" w:fill="FFFFFF"/>
+        <w:spacing w:after="0" w:line="240" w:lineRule="auto"/>
+        <w:rPr>
+          <w:rFonts w:ascii="Nunito" w:eastAsia="Times New Roman" w:hAnsi="Nunito" w:cs="Times New Roman"/>
+          <w:color w:val="000000"/>
+          <w:kern w:val="0"/>
+          <w:lang w:eastAsia="tr-TR"/>
+          <w14:ligatures w14:val="none"/>
+        </w:rPr>
+      </w:pPr>
+      <w:r>
+        <w:rPr>
+          <w:rFonts w:ascii="Lucida Sans Unicode" w:eastAsia="Times New Roman" w:hAnsi="Lucida Sans Unicode" w:cs="Lucida Sans Unicode"/>
+          <w:color w:val="000000"/>
+          <w:kern w:val="0"/>
+          <w:bdr w:val="single" w:sz="2" w:space="0" w:color="F1F4F5" w:frame="1"/>
+          <w:lang w:eastAsia="tr-TR"/>
+          <w14:ligatures w14:val="none"/>
+        </w:rPr>
+        <w:t>-Büyük Harflerin Kullanıldığı Yerler</w:t>
+      </w:r>
+    </w:p>
+    <w:p>
+      <w:pPr>
+        <w:pBdr>
+          <w:top w:val="single" w:sz="2" w:space="0" w:color="F1F4F5"/>
+          <w:left w:val="single" w:sz="2" w:space="0" w:color="F1F4F5"/>
+          <w:bottom w:val="single" w:sz="2" w:space="0" w:color="F1F4F5"/>
+          <w:right w:val="single" w:sz="2" w:space="0" w:color="F1F4F5"/>
+        </w:pBdr>
+        <w:shd w:val="clear" w:color="auto" w:fill="FFFFFF"/>
+        <w:spacing w:after="0" w:line="240" w:lineRule="auto"/>
+        <w:rPr>
+          <w:rFonts w:ascii="Nunito" w:eastAsia="Times New Roman" w:hAnsi="Nunito" w:cs="Times New Roman"/>
+          <w:color w:val="000000"/>
+          <w:kern w:val="0"/>
+          <w:lang w:eastAsia="tr-TR"/>
+          <w14:ligatures w14:val="none"/>
+        </w:rPr>
+      </w:pPr>
+      <w:r>
+        <w:rPr>
+          <w:rFonts w:ascii="Lucida Sans Unicode" w:eastAsia="Times New Roman" w:hAnsi="Lucida Sans Unicode" w:cs="Lucida Sans Unicode"/>
+          <w:color w:val="000000"/>
+          <w:kern w:val="0"/>
+          <w:bdr w:val="single" w:sz="2" w:space="0" w:color="F1F4F5" w:frame="1"/>
+          <w:lang w:eastAsia="tr-TR"/>
+          <w14:ligatures w14:val="none"/>
+        </w:rPr>
+        <w:t xml:space="preserve">-De, Ki ve </w:t>
+      </w:r>
+      <w:proofErr w:type="spellStart"/>
+      <w:r>
+        <w:rPr>
+          <w:rFonts w:ascii="Lucida Sans Unicode" w:eastAsia="Times New Roman" w:hAnsi="Lucida Sans Unicode" w:cs="Lucida Sans Unicode"/>
+          <w:color w:val="000000"/>
+          <w:kern w:val="0"/>
+          <w:bdr w:val="single" w:sz="2" w:space="0" w:color="F1F4F5" w:frame="1"/>
+          <w:lang w:eastAsia="tr-TR"/>
+          <w14:ligatures w14:val="none"/>
+        </w:rPr>
+        <w:t>Mi’nin</w:t>
+      </w:r>
+      <w:proofErr w:type="spellEnd"/>
+      <w:r>
+        <w:rPr>
+          <w:rFonts w:ascii="Lucida Sans Unicode" w:eastAsia="Times New Roman" w:hAnsi="Lucida Sans Unicode" w:cs="Lucida Sans Unicode"/>
+          <w:color w:val="000000"/>
+          <w:kern w:val="0"/>
+          <w:bdr w:val="single" w:sz="2" w:space="0" w:color="F1F4F5" w:frame="1"/>
+          <w:lang w:eastAsia="tr-TR"/>
+          <w14:ligatures w14:val="none"/>
+        </w:rPr>
+        <w:t xml:space="preserve"> Yazımı</w:t>
+      </w:r>
+    </w:p>
+    <w:p>
+      <w:pPr>
+        <w:pBdr>
+          <w:top w:val="single" w:sz="2" w:space="0" w:color="F1F4F5"/>
+          <w:left w:val="single" w:sz="2" w:space="0" w:color="F1F4F5"/>
+          <w:bottom w:val="single" w:sz="2" w:space="0" w:color="F1F4F5"/>
+          <w:right w:val="single" w:sz="2" w:space="0" w:color="F1F4F5"/>
+        </w:pBdr>
+        <w:shd w:val="clear" w:color="auto" w:fill="FFFFFF"/>
+        <w:spacing w:after="0" w:line="240" w:lineRule="auto"/>
+        <w:rPr>
+          <w:rFonts w:ascii="Nunito" w:eastAsia="Times New Roman" w:hAnsi="Nunito" w:cs="Times New Roman"/>
+          <w:color w:val="000000"/>
+          <w:kern w:val="0"/>
+          <w:lang w:eastAsia="tr-TR"/>
+          <w14:ligatures w14:val="none"/>
+        </w:rPr>
+      </w:pPr>
+      <w:r>
+        <w:rPr>
+          <w:rFonts w:ascii="Lucida Sans Unicode" w:eastAsia="Times New Roman" w:hAnsi="Lucida Sans Unicode" w:cs="Lucida Sans Unicode"/>
+          <w:color w:val="000000"/>
+          <w:kern w:val="0"/>
+          <w:bdr w:val="single" w:sz="2" w:space="0" w:color="F1F4F5" w:frame="1"/>
+          <w:lang w:eastAsia="tr-TR"/>
+          <w14:ligatures w14:val="none"/>
+        </w:rPr>
+        <w:t>-Birleşik Kelimelerin Yazımı</w:t>
+      </w:r>
+    </w:p>
+    <w:p>
+      <w:pPr>
+        <w:pBdr>
+          <w:top w:val="single" w:sz="2" w:space="0" w:color="F1F4F5"/>
+          <w:left w:val="single" w:sz="2" w:space="0" w:color="F1F4F5"/>
+          <w:bottom w:val="single" w:sz="2" w:space="0" w:color="F1F4F5"/>
+          <w:right w:val="single" w:sz="2" w:space="0" w:color="F1F4F5"/>
+        </w:pBdr>
+        <w:shd w:val="clear" w:color="auto" w:fill="FFFFFF"/>
+        <w:spacing w:after="0" w:line="240" w:lineRule="auto"/>
+        <w:rPr>
+          <w:rFonts w:ascii="Nunito" w:eastAsia="Times New Roman" w:hAnsi="Nunito" w:cs="Times New Roman"/>
+          <w:color w:val="000000"/>
+          <w:kern w:val="0"/>
+          <w:lang w:eastAsia="tr-TR"/>
+          <w14:ligatures w14:val="none"/>
+        </w:rPr>
+      </w:pPr>
+      <w:r>
+        <w:rPr>
+          <w:rFonts w:ascii="Lucida Sans Unicode" w:eastAsia="Times New Roman" w:hAnsi="Lucida Sans Unicode" w:cs="Lucida Sans Unicode"/>
+          <w:color w:val="000000"/>
+          <w:kern w:val="0"/>
+          <w:bdr w:val="single" w:sz="2" w:space="0" w:color="F1F4F5" w:frame="1"/>
+          <w:lang w:eastAsia="tr-TR"/>
+          <w14:ligatures w14:val="none"/>
+        </w:rPr>
+        <w:t>-Kısaltma, Sayıların Yazımı ve Yazımı Karıştırılan Sözcükler</w:t>
+      </w:r>
+    </w:p>
+    <w:p>
+      <w:pPr>
+        <w:pBdr>
+          <w:top w:val="single" w:sz="2" w:space="0" w:color="F1F4F5"/>
+          <w:left w:val="single" w:sz="2" w:space="0" w:color="F1F4F5"/>
+          <w:bottom w:val="single" w:sz="2" w:space="0" w:color="F1F4F5"/>
+          <w:right w:val="single" w:sz="2" w:space="0" w:color="F1F4F5"/>
+        </w:pBdr>
+        <w:shd w:val="clear" w:color="auto" w:fill="FFFFFF"/>
+        <w:spacing w:after="0" w:line="240" w:lineRule="auto"/>
+        <w:outlineLvl w:val="2"/>
+        <w:rPr>
+          <w:rFonts w:ascii="Nunito" w:eastAsia="Times New Roman" w:hAnsi="Nunito" w:cs="Times New Roman"/>
+          <w:b/>
+          <w:bCs/>
+          <w:color w:val="000000"/>
+          <w:kern w:val="0"/>
+          <w:lang w:eastAsia="tr-TR"/>
+          <w14:ligatures w14:val="none"/>
+        </w:rPr>
+      </w:pPr>
+      <w:r>
+        <w:rPr>
+          <w:rFonts w:ascii="inherit" w:eastAsia="Times New Roman" w:hAnsi="inherit" w:cs="Lucida Sans Unicode"/>
+          <w:b/>
+          <w:bCs/>
+          <w:color w:val="000000"/>
+          <w:kern w:val="0"/>
+          <w:sz w:val="27"/>
+          <w:szCs w:val="27"/>
+          <w:bdr w:val="single" w:sz="2" w:space="0" w:color="F1F4F5" w:frame="1"/>
+          <w:lang w:eastAsia="tr-TR"/>
+          <w14:ligatures w14:val="none"/>
+        </w:rPr>
+        <w:t xml:space="preserve">10 </w:t>
+      </w:r>
+      <w:r>
+        <w:rPr>
+          <w:rFonts w:ascii="inherit" w:eastAsia="Times New Roman" w:hAnsi="inherit" w:cs="Lucida Sans Unicode"/>
+          <w:b/>
+          <w:bCs/>
+          <w:color w:val="000000"/>
+          <w:kern w:val="0"/>
+          <w:sz w:val="27"/>
+          <w:szCs w:val="27"/>
+          <w:bdr w:val="single" w:sz="2" w:space="0" w:color="F1F4F5" w:frame="1"/>
+          <w:lang w:eastAsia="tr-TR"/>
+          <w14:ligatures w14:val="none"/>
+        </w:rPr>
+        <w:t>Noktalama İşaretleri</w:t>
+      </w:r>
+    </w:p>
+    <w:p>
+      <w:pPr>
+        <w:pBdr>
+          <w:top w:val="single" w:sz="2" w:space="0" w:color="F1F4F5"/>
+          <w:left w:val="single" w:sz="2" w:space="0" w:color="F1F4F5"/>
+          <w:bottom w:val="single" w:sz="2" w:space="0" w:color="F1F4F5"/>
+          <w:right w:val="single" w:sz="2" w:space="0" w:color="F1F4F5"/>
+        </w:pBdr>
+        <w:shd w:val="clear" w:color="auto" w:fill="FFFFFF"/>
+        <w:spacing w:after="0" w:line="240" w:lineRule="auto"/>
+        <w:rPr>
+          <w:rFonts w:ascii="Nunito" w:eastAsia="Times New Roman" w:hAnsi="Nunito" w:cs="Times New Roman"/>
+          <w:color w:val="000000"/>
+          <w:kern w:val="0"/>
+          <w:lang w:eastAsia="tr-TR"/>
+          <w14:ligatures w14:val="none"/>
+        </w:rPr>
+      </w:pPr>
+      <w:r>
+        <w:rPr>
+          <w:rFonts w:ascii="Lucida Sans Unicode" w:eastAsia="Times New Roman" w:hAnsi="Lucida Sans Unicode" w:cs="Lucida Sans Unicode"/>
+          <w:color w:val="000000"/>
+          <w:kern w:val="0"/>
+          <w:bdr w:val="single" w:sz="2" w:space="0" w:color="F1F4F5" w:frame="1"/>
+          <w:lang w:eastAsia="tr-TR"/>
+          <w14:ligatures w14:val="none"/>
+        </w:rPr>
+        <w:t xml:space="preserve">-Nokta, </w:t>
+      </w:r>
+      <w:proofErr w:type="gramStart"/>
+      <w:r>
+        <w:rPr>
+          <w:rFonts w:ascii="Lucida Sans Unicode" w:eastAsia="Times New Roman" w:hAnsi="Lucida Sans Unicode" w:cs="Lucida Sans Unicode"/>
+          <w:color w:val="000000"/>
+          <w:kern w:val="0"/>
+          <w:bdr w:val="single" w:sz="2" w:space="0" w:color="F1F4F5" w:frame="1"/>
+          <w:lang w:eastAsia="tr-TR"/>
+          <w14:ligatures w14:val="none"/>
+        </w:rPr>
+        <w:t>Virgül ,</w:t>
+      </w:r>
+      <w:proofErr w:type="gramEnd"/>
+      <w:r>
+        <w:rPr>
+          <w:rFonts w:ascii="Lucida Sans Unicode" w:eastAsia="Times New Roman" w:hAnsi="Lucida Sans Unicode" w:cs="Lucida Sans Unicode"/>
+          <w:color w:val="000000"/>
+          <w:kern w:val="0"/>
+          <w:bdr w:val="single" w:sz="2" w:space="0" w:color="F1F4F5" w:frame="1"/>
+          <w:lang w:eastAsia="tr-TR"/>
+          <w14:ligatures w14:val="none"/>
+        </w:rPr>
+        <w:t xml:space="preserve"> İki Nokta, Noktalı Virgül ve Üç Nokta</w:t>
+      </w:r>
+    </w:p>
+    <w:p>
+      <w:pPr>
+        <w:pBdr>
+          <w:top w:val="single" w:sz="2" w:space="0" w:color="F1F4F5"/>
+          <w:left w:val="single" w:sz="2" w:space="0" w:color="F1F4F5"/>
+          <w:bottom w:val="single" w:sz="2" w:space="0" w:color="F1F4F5"/>
+          <w:right w:val="single" w:sz="2" w:space="0" w:color="F1F4F5"/>
+        </w:pBdr>
+        <w:shd w:val="clear" w:color="auto" w:fill="FFFFFF"/>
+        <w:spacing w:after="0" w:line="240" w:lineRule="auto"/>
+        <w:rPr>
+          <w:rFonts w:ascii="Nunito" w:eastAsia="Times New Roman" w:hAnsi="Nunito" w:cs="Times New Roman"/>
+          <w:color w:val="000000"/>
+          <w:kern w:val="0"/>
+          <w:lang w:eastAsia="tr-TR"/>
+          <w14:ligatures w14:val="none"/>
+        </w:rPr>
+      </w:pPr>
+      <w:r>
+        <w:rPr>
+          <w:rFonts w:ascii="Lucida Sans Unicode" w:eastAsia="Times New Roman" w:hAnsi="Lucida Sans Unicode" w:cs="Lucida Sans Unicode"/>
+          <w:color w:val="000000"/>
+          <w:kern w:val="0"/>
+          <w:bdr w:val="single" w:sz="2" w:space="0" w:color="F1F4F5" w:frame="1"/>
+          <w:lang w:eastAsia="tr-TR"/>
+          <w14:ligatures w14:val="none"/>
+        </w:rPr>
+        <w:t>-Soru, Ünlem, Tırnak, Kesme, Yay Ayraç, Kısa ve Uzun Çizgi, Eğik Çizgi</w:t>
+      </w:r>
+    </w:p>
+    <w:p>
+      <w:pPr>
+        <w:pBdr>
+          <w:top w:val="single" w:sz="2" w:space="0" w:color="F1F4F5"/>
+          <w:left w:val="single" w:sz="2" w:space="0" w:color="F1F4F5"/>
+          <w:bottom w:val="single" w:sz="2" w:space="0" w:color="F1F4F5"/>
+          <w:right w:val="single" w:sz="2" w:space="0" w:color="F1F4F5"/>
+        </w:pBdr>
+        <w:shd w:val="clear" w:color="auto" w:fill="FFFFFF"/>
+        <w:spacing w:after="0" w:line="240" w:lineRule="auto"/>
+        <w:outlineLvl w:val="2"/>
+        <w:rPr>
+          <w:rFonts w:ascii="Nunito" w:eastAsia="Times New Roman" w:hAnsi="Nunito" w:cs="Times New Roman"/>
+          <w:b/>
+          <w:bCs/>
+          <w:color w:val="000000"/>
+          <w:kern w:val="0"/>
+          <w:lang w:eastAsia="tr-TR"/>
+          <w14:ligatures w14:val="none"/>
+        </w:rPr>
+      </w:pPr>
+      <w:r>
+        <w:rPr>
+          <w:rFonts w:ascii="inherit" w:eastAsia="Times New Roman" w:hAnsi="inherit" w:cs="Lucida Sans Unicode"/>
+          <w:b/>
+          <w:bCs/>
+          <w:color w:val="000000"/>
+          <w:kern w:val="0"/>
+          <w:sz w:val="27"/>
+          <w:szCs w:val="27"/>
+          <w:bdr w:val="single" w:sz="2" w:space="0" w:color="F1F4F5" w:frame="1"/>
+          <w:lang w:eastAsia="tr-TR"/>
+          <w14:ligatures w14:val="none"/>
+        </w:rPr>
+        <w:t xml:space="preserve">11 </w:t>
+      </w:r>
       <w:r>
         <w:rPr>
           <w:rFonts w:ascii="inherit" w:eastAsia="Times New Roman" w:hAnsi="inherit" w:cs="Lucida Sans Unicode"/>

</xml_diff>